<commit_message>
hoan thanh bai 1 2 3 tuan 2
</commit_message>
<xml_diff>
--- a/tuan3/State, Strategy, Decorator/Design Pattern-Part 1 (State, Strategy, Decorator).docx
+++ b/tuan3/State, Strategy, Decorator/Design Pattern-Part 1 (State, Strategy, Decorator).docx
@@ -1,22 +1,22 @@
 
 <file path=word/document.xml><?xml version="1.0" encoding="utf-8"?>
-<w:document xmlns:wpc="http://schemas.microsoft.com/office/word/2010/wordprocessingCanvas" xmlns:mc="http://schemas.openxmlformats.org/markup-compatibility/2006" xmlns:o="urn:schemas-microsoft-com:office:office" xmlns:r="http://schemas.openxmlformats.org/officeDocument/2006/relationships" xmlns:m="http://schemas.openxmlformats.org/officeDocument/2006/math" xmlns:v="urn:schemas-microsoft-com:vml" xmlns:wp14="http://schemas.microsoft.com/office/word/2010/wordprocessingDrawing" xmlns:wp="http://schemas.openxmlformats.org/drawingml/2006/wordprocessingDrawing" xmlns:w10="urn:schemas-microsoft-com:office:word" xmlns:w="http://schemas.openxmlformats.org/wordprocessingml/2006/main" xmlns:w14="http://schemas.microsoft.com/office/word/2010/wordml" xmlns:w15="http://schemas.microsoft.com/office/word/2012/wordml" xmlns:wpg="http://schemas.microsoft.com/office/word/2010/wordprocessingGroup" xmlns:wpi="http://schemas.microsoft.com/office/word/2010/wordprocessingInk" xmlns:wne="http://schemas.microsoft.com/office/word/2006/wordml" xmlns:wps="http://schemas.microsoft.com/office/word/2010/wordprocessingShape" mc:Ignorable="w14 w15 wp14">
+<w:document xmlns:wpc="http://schemas.microsoft.com/office/word/2010/wordprocessingCanvas" xmlns:cx="http://schemas.microsoft.com/office/drawing/2014/chartex" xmlns:cx1="http://schemas.microsoft.com/office/drawing/2015/9/8/chartex" xmlns:cx2="http://schemas.microsoft.com/office/drawing/2015/10/21/chartex" xmlns:cx3="http://schemas.microsoft.com/office/drawing/2016/5/9/chartex" xmlns:cx4="http://schemas.microsoft.com/office/drawing/2016/5/10/chartex" xmlns:cx5="http://schemas.microsoft.com/office/drawing/2016/5/11/chartex" xmlns:cx6="http://schemas.microsoft.com/office/drawing/2016/5/12/chartex" xmlns:cx7="http://schemas.microsoft.com/office/drawing/2016/5/13/chartex" xmlns:cx8="http://schemas.microsoft.com/office/drawing/2016/5/14/chartex" xmlns:mc="http://schemas.openxmlformats.org/markup-compatibility/2006" xmlns:aink="http://schemas.microsoft.com/office/drawing/2016/ink" xmlns:am3d="http://schemas.microsoft.com/office/drawing/2017/model3d" xmlns:o="urn:schemas-microsoft-com:office:office" xmlns:oel="http://schemas.microsoft.com/office/2019/extlst" xmlns:r="http://schemas.openxmlformats.org/officeDocument/2006/relationships" xmlns:m="http://schemas.openxmlformats.org/officeDocument/2006/math" xmlns:v="urn:schemas-microsoft-com:vml" xmlns:wp14="http://schemas.microsoft.com/office/word/2010/wordprocessingDrawing" xmlns:wp="http://schemas.openxmlformats.org/drawingml/2006/wordprocessingDrawing" xmlns:w10="urn:schemas-microsoft-com:office:word" xmlns:w="http://schemas.openxmlformats.org/wordprocessingml/2006/main" xmlns:w14="http://schemas.microsoft.com/office/word/2010/wordml" xmlns:w15="http://schemas.microsoft.com/office/word/2012/wordml" xmlns:w16cex="http://schemas.microsoft.com/office/word/2018/wordml/cex" xmlns:w16cid="http://schemas.microsoft.com/office/word/2016/wordml/cid" xmlns:w16="http://schemas.microsoft.com/office/word/2018/wordml" xmlns:w16du="http://schemas.microsoft.com/office/word/2023/wordml/word16du" xmlns:w16sdtdh="http://schemas.microsoft.com/office/word/2020/wordml/sdtdatahash" xmlns:w16sdtfl="http://schemas.microsoft.com/office/word/2024/wordml/sdtformatlock" xmlns:w16se="http://schemas.microsoft.com/office/word/2015/wordml/symex" xmlns:wpg="http://schemas.microsoft.com/office/word/2010/wordprocessingGroup" xmlns:wpi="http://schemas.microsoft.com/office/word/2010/wordprocessingInk" xmlns:wne="http://schemas.microsoft.com/office/word/2006/wordml" xmlns:wps="http://schemas.microsoft.com/office/word/2010/wordprocessingShape" mc:Ignorable="w14 w15 w16se w16cid w16 w16cex w16sdtdh w16sdtfl w16du wp14">
   <w:body>
     <w:p>
       <w:pPr>
         <w:rPr>
           <w:rFonts w:ascii="Times New Roman" w:hAnsi="Times New Roman" w:cs="Times New Roman"/>
           <w:b/>
-          <w:sz w:val="28"/>
-          <w:szCs w:val="28"/>
-        </w:rPr>
-      </w:pPr>
-      <w:r>
-        <w:rPr>
-          <w:rFonts w:ascii="Times New Roman" w:hAnsi="Times New Roman" w:cs="Times New Roman"/>
-          <w:b/>
-          <w:sz w:val="28"/>
-          <w:szCs w:val="28"/>
+          <w:sz w:val="26"/>
+          <w:szCs w:val="26"/>
+        </w:rPr>
+      </w:pPr>
+      <w:r>
+        <w:rPr>
+          <w:rFonts w:ascii="Times New Roman" w:hAnsi="Times New Roman" w:cs="Times New Roman"/>
+          <w:b/>
+          <w:sz w:val="26"/>
+          <w:szCs w:val="26"/>
         </w:rPr>
         <w:t>Nguyễn Ngọc Hồng Minh -22690581</w:t>
       </w:r>
@@ -27,8 +27,8 @@
         <w:rPr>
           <w:rFonts w:ascii="Times New Roman" w:hAnsi="Times New Roman" w:cs="Times New Roman"/>
           <w:b/>
-          <w:sz w:val="28"/>
-          <w:szCs w:val="28"/>
+          <w:sz w:val="26"/>
+          <w:szCs w:val="26"/>
         </w:rPr>
       </w:pPr>
     </w:p>
@@ -56,81 +56,49 @@
       <w:pPr>
         <w:rPr>
           <w:rFonts w:ascii="Times New Roman" w:hAnsi="Times New Roman" w:cs="Times New Roman"/>
-          <w:sz w:val="28"/>
-          <w:szCs w:val="28"/>
-        </w:rPr>
-      </w:pPr>
-      <w:r>
-        <w:rPr>
-          <w:rFonts w:ascii="Times New Roman" w:hAnsi="Times New Roman" w:cs="Times New Roman"/>
-          <w:sz w:val="28"/>
-          <w:szCs w:val="28"/>
-        </w:rPr>
-        <w:t>1. Tạo một hệ thống quản lý đơn hàng có các trạng thái như: Mới tạo, Đang xử lý, Đã giao, và Hủy.</w:t>
-      </w:r>
-      <w:r>
-        <w:rPr>
-          <w:rFonts w:ascii="Times New Roman" w:hAnsi="Times New Roman" w:cs="Times New Roman"/>
-          <w:sz w:val="28"/>
-          <w:szCs w:val="28"/>
-        </w:rPr>
-        <w:t xml:space="preserve"> </w:t>
-      </w:r>
-      <w:r>
-        <w:rPr>
-          <w:rFonts w:ascii="Times New Roman" w:hAnsi="Times New Roman" w:cs="Times New Roman"/>
-          <w:sz w:val="28"/>
-          <w:szCs w:val="28"/>
-        </w:rPr>
-        <w:t xml:space="preserve"> Mỗi trạng thái sẽ có các hành </w:t>
-      </w:r>
-      <w:proofErr w:type="gramStart"/>
-      <w:r>
-        <w:rPr>
-          <w:rFonts w:ascii="Times New Roman" w:hAnsi="Times New Roman" w:cs="Times New Roman"/>
-          <w:sz w:val="28"/>
-          <w:szCs w:val="28"/>
-        </w:rPr>
-        <w:t>vi</w:t>
-      </w:r>
-      <w:proofErr w:type="gramEnd"/>
-      <w:r>
-        <w:rPr>
-          <w:rFonts w:ascii="Times New Roman" w:hAnsi="Times New Roman" w:cs="Times New Roman"/>
-          <w:sz w:val="28"/>
-          <w:szCs w:val="28"/>
-        </w:rPr>
-        <w:t xml:space="preserve"> khác nhau. Ví dụ</w:t>
-      </w:r>
-      <w:r>
-        <w:rPr>
-          <w:rFonts w:ascii="Times New Roman" w:hAnsi="Times New Roman" w:cs="Times New Roman"/>
-          <w:sz w:val="28"/>
-          <w:szCs w:val="28"/>
-        </w:rPr>
-        <w:t>:</w:t>
-      </w:r>
-      <w:r>
-        <w:rPr>
-          <w:rFonts w:ascii="Times New Roman" w:hAnsi="Times New Roman" w:cs="Times New Roman"/>
-          <w:sz w:val="28"/>
-          <w:szCs w:val="28"/>
+          <w:b/>
+          <w:bCs/>
+          <w:sz w:val="26"/>
+          <w:szCs w:val="26"/>
+        </w:rPr>
+      </w:pPr>
+      <w:r>
+        <w:rPr>
+          <w:rFonts w:ascii="Times New Roman" w:hAnsi="Times New Roman" w:cs="Times New Roman"/>
+          <w:b/>
+          <w:bCs/>
+          <w:sz w:val="26"/>
+          <w:szCs w:val="26"/>
+        </w:rPr>
+        <w:t>1. Tạo một hệ thống quản lý đơn hàng có các trạng thái như: Mới tạo, Đang xử lý, Đã giao, và Hủy.  Mỗi trạng thái sẽ có các hành vi khác nhau. Ví dụ:</w:t>
+      </w:r>
+      <w:r>
+        <w:rPr>
+          <w:rFonts w:ascii="Times New Roman" w:hAnsi="Times New Roman" w:cs="Times New Roman"/>
+          <w:b/>
+          <w:bCs/>
+          <w:sz w:val="26"/>
+          <w:szCs w:val="26"/>
         </w:rPr>
         <w:tab/>
       </w:r>
       <w:r>
         <w:rPr>
           <w:rFonts w:ascii="Times New Roman" w:hAnsi="Times New Roman" w:cs="Times New Roman"/>
-          <w:sz w:val="28"/>
-          <w:szCs w:val="28"/>
+          <w:b/>
+          <w:bCs/>
+          <w:sz w:val="26"/>
+          <w:szCs w:val="26"/>
         </w:rPr>
         <w:tab/>
       </w:r>
       <w:r>
         <w:rPr>
           <w:rFonts w:ascii="Times New Roman" w:hAnsi="Times New Roman" w:cs="Times New Roman"/>
-          <w:sz w:val="28"/>
-          <w:szCs w:val="28"/>
+          <w:b/>
+          <w:bCs/>
+          <w:sz w:val="26"/>
+          <w:szCs w:val="26"/>
         </w:rPr>
         <w:tab/>
       </w:r>
@@ -144,39 +112,49 @@
         </w:numPr>
         <w:rPr>
           <w:rFonts w:ascii="Times New Roman" w:hAnsi="Times New Roman" w:cs="Times New Roman"/>
-          <w:sz w:val="28"/>
-          <w:szCs w:val="28"/>
-        </w:rPr>
-      </w:pPr>
-      <w:r>
-        <w:rPr>
-          <w:rFonts w:ascii="Times New Roman" w:hAnsi="Times New Roman" w:cs="Times New Roman"/>
-          <w:sz w:val="28"/>
-          <w:szCs w:val="28"/>
+          <w:b/>
+          <w:bCs/>
+          <w:sz w:val="26"/>
+          <w:szCs w:val="26"/>
+        </w:rPr>
+      </w:pPr>
+      <w:r>
+        <w:rPr>
+          <w:rFonts w:ascii="Times New Roman" w:hAnsi="Times New Roman" w:cs="Times New Roman"/>
+          <w:b/>
+          <w:bCs/>
+          <w:sz w:val="26"/>
+          <w:szCs w:val="26"/>
         </w:rPr>
         <w:t>Mới tạo: Kiểm tra thông tin đơn hàng.</w:t>
       </w:r>
       <w:r>
         <w:rPr>
           <w:rFonts w:ascii="Times New Roman" w:hAnsi="Times New Roman" w:cs="Times New Roman"/>
-          <w:sz w:val="28"/>
-          <w:szCs w:val="28"/>
+          <w:b/>
+          <w:bCs/>
+          <w:sz w:val="26"/>
+          <w:szCs w:val="26"/>
         </w:rPr>
         <w:tab/>
       </w:r>
       <w:r>
         <w:rPr>
           <w:rFonts w:ascii="Times New Roman" w:hAnsi="Times New Roman" w:cs="Times New Roman"/>
-          <w:sz w:val="28"/>
-          <w:szCs w:val="28"/>
+          <w:b/>
+          <w:bCs/>
+          <w:sz w:val="26"/>
+          <w:szCs w:val="26"/>
         </w:rPr>
         <w:tab/>
       </w:r>
       <w:r>
         <w:rPr>
           <w:rFonts w:ascii="Times New Roman" w:hAnsi="Times New Roman" w:cs="Times New Roman"/>
-          <w:sz w:val="28"/>
-          <w:szCs w:val="28"/>
+          <w:b/>
+          <w:bCs/>
+          <w:sz w:val="26"/>
+          <w:szCs w:val="26"/>
         </w:rPr>
         <w:tab/>
       </w:r>
@@ -190,39 +168,49 @@
         </w:numPr>
         <w:rPr>
           <w:rFonts w:ascii="Times New Roman" w:hAnsi="Times New Roman" w:cs="Times New Roman"/>
-          <w:sz w:val="28"/>
-          <w:szCs w:val="28"/>
-        </w:rPr>
-      </w:pPr>
-      <w:r>
-        <w:rPr>
-          <w:rFonts w:ascii="Times New Roman" w:hAnsi="Times New Roman" w:cs="Times New Roman"/>
-          <w:sz w:val="28"/>
-          <w:szCs w:val="28"/>
+          <w:b/>
+          <w:bCs/>
+          <w:sz w:val="26"/>
+          <w:szCs w:val="26"/>
+        </w:rPr>
+      </w:pPr>
+      <w:r>
+        <w:rPr>
+          <w:rFonts w:ascii="Times New Roman" w:hAnsi="Times New Roman" w:cs="Times New Roman"/>
+          <w:b/>
+          <w:bCs/>
+          <w:sz w:val="26"/>
+          <w:szCs w:val="26"/>
         </w:rPr>
         <w:t>Đang xử lý: Đóng gói và vận chuyển.</w:t>
       </w:r>
       <w:r>
         <w:rPr>
           <w:rFonts w:ascii="Times New Roman" w:hAnsi="Times New Roman" w:cs="Times New Roman"/>
-          <w:sz w:val="28"/>
-          <w:szCs w:val="28"/>
+          <w:b/>
+          <w:bCs/>
+          <w:sz w:val="26"/>
+          <w:szCs w:val="26"/>
         </w:rPr>
         <w:tab/>
       </w:r>
       <w:r>
         <w:rPr>
           <w:rFonts w:ascii="Times New Roman" w:hAnsi="Times New Roman" w:cs="Times New Roman"/>
-          <w:sz w:val="28"/>
-          <w:szCs w:val="28"/>
+          <w:b/>
+          <w:bCs/>
+          <w:sz w:val="26"/>
+          <w:szCs w:val="26"/>
         </w:rPr>
         <w:tab/>
       </w:r>
       <w:r>
         <w:rPr>
           <w:rFonts w:ascii="Times New Roman" w:hAnsi="Times New Roman" w:cs="Times New Roman"/>
-          <w:sz w:val="28"/>
-          <w:szCs w:val="28"/>
+          <w:b/>
+          <w:bCs/>
+          <w:sz w:val="26"/>
+          <w:szCs w:val="26"/>
         </w:rPr>
         <w:tab/>
       </w:r>
@@ -236,39 +224,49 @@
         </w:numPr>
         <w:rPr>
           <w:rFonts w:ascii="Times New Roman" w:hAnsi="Times New Roman" w:cs="Times New Roman"/>
-          <w:sz w:val="28"/>
-          <w:szCs w:val="28"/>
-        </w:rPr>
-      </w:pPr>
-      <w:r>
-        <w:rPr>
-          <w:rFonts w:ascii="Times New Roman" w:hAnsi="Times New Roman" w:cs="Times New Roman"/>
-          <w:sz w:val="28"/>
-          <w:szCs w:val="28"/>
+          <w:b/>
+          <w:bCs/>
+          <w:sz w:val="26"/>
+          <w:szCs w:val="26"/>
+        </w:rPr>
+      </w:pPr>
+      <w:r>
+        <w:rPr>
+          <w:rFonts w:ascii="Times New Roman" w:hAnsi="Times New Roman" w:cs="Times New Roman"/>
+          <w:b/>
+          <w:bCs/>
+          <w:sz w:val="26"/>
+          <w:szCs w:val="26"/>
         </w:rPr>
         <w:t>Đã giao: Cập nhật trạng thái đơn hàng là đã giao.</w:t>
       </w:r>
       <w:r>
         <w:rPr>
           <w:rFonts w:ascii="Times New Roman" w:hAnsi="Times New Roman" w:cs="Times New Roman"/>
-          <w:sz w:val="28"/>
-          <w:szCs w:val="28"/>
+          <w:b/>
+          <w:bCs/>
+          <w:sz w:val="26"/>
+          <w:szCs w:val="26"/>
         </w:rPr>
         <w:tab/>
       </w:r>
       <w:r>
         <w:rPr>
           <w:rFonts w:ascii="Times New Roman" w:hAnsi="Times New Roman" w:cs="Times New Roman"/>
-          <w:sz w:val="28"/>
-          <w:szCs w:val="28"/>
+          <w:b/>
+          <w:bCs/>
+          <w:sz w:val="26"/>
+          <w:szCs w:val="26"/>
         </w:rPr>
         <w:tab/>
       </w:r>
       <w:r>
         <w:rPr>
           <w:rFonts w:ascii="Times New Roman" w:hAnsi="Times New Roman" w:cs="Times New Roman"/>
-          <w:sz w:val="28"/>
-          <w:szCs w:val="28"/>
+          <w:b/>
+          <w:bCs/>
+          <w:sz w:val="26"/>
+          <w:szCs w:val="26"/>
         </w:rPr>
         <w:tab/>
       </w:r>
@@ -282,39 +280,49 @@
         </w:numPr>
         <w:rPr>
           <w:rFonts w:ascii="Times New Roman" w:hAnsi="Times New Roman" w:cs="Times New Roman"/>
-          <w:sz w:val="28"/>
-          <w:szCs w:val="28"/>
-        </w:rPr>
-      </w:pPr>
-      <w:r>
-        <w:rPr>
-          <w:rFonts w:ascii="Times New Roman" w:hAnsi="Times New Roman" w:cs="Times New Roman"/>
-          <w:sz w:val="28"/>
-          <w:szCs w:val="28"/>
+          <w:b/>
+          <w:bCs/>
+          <w:sz w:val="26"/>
+          <w:szCs w:val="26"/>
+        </w:rPr>
+      </w:pPr>
+      <w:r>
+        <w:rPr>
+          <w:rFonts w:ascii="Times New Roman" w:hAnsi="Times New Roman" w:cs="Times New Roman"/>
+          <w:b/>
+          <w:bCs/>
+          <w:sz w:val="26"/>
+          <w:szCs w:val="26"/>
         </w:rPr>
         <w:t>Hủy: Hủy đơn hàng và hoàn tiền.</w:t>
       </w:r>
       <w:r>
         <w:rPr>
           <w:rFonts w:ascii="Times New Roman" w:hAnsi="Times New Roman" w:cs="Times New Roman"/>
-          <w:sz w:val="28"/>
-          <w:szCs w:val="28"/>
+          <w:b/>
+          <w:bCs/>
+          <w:sz w:val="26"/>
+          <w:szCs w:val="26"/>
         </w:rPr>
         <w:tab/>
       </w:r>
       <w:r>
         <w:rPr>
           <w:rFonts w:ascii="Times New Roman" w:hAnsi="Times New Roman" w:cs="Times New Roman"/>
-          <w:sz w:val="28"/>
-          <w:szCs w:val="28"/>
+          <w:b/>
+          <w:bCs/>
+          <w:sz w:val="26"/>
+          <w:szCs w:val="26"/>
         </w:rPr>
         <w:tab/>
       </w:r>
       <w:r>
         <w:rPr>
           <w:rFonts w:ascii="Times New Roman" w:hAnsi="Times New Roman" w:cs="Times New Roman"/>
-          <w:sz w:val="28"/>
-          <w:szCs w:val="28"/>
+          <w:b/>
+          <w:bCs/>
+          <w:sz w:val="26"/>
+          <w:szCs w:val="26"/>
         </w:rPr>
         <w:tab/>
       </w:r>
@@ -323,15 +331,19 @@
       <w:pPr>
         <w:rPr>
           <w:rFonts w:ascii="Times New Roman" w:hAnsi="Times New Roman" w:cs="Times New Roman"/>
-          <w:sz w:val="28"/>
-          <w:szCs w:val="28"/>
-        </w:rPr>
-      </w:pPr>
-      <w:r>
-        <w:rPr>
-          <w:rFonts w:ascii="Times New Roman" w:hAnsi="Times New Roman" w:cs="Times New Roman"/>
-          <w:sz w:val="28"/>
-          <w:szCs w:val="28"/>
+          <w:b/>
+          <w:bCs/>
+          <w:sz w:val="26"/>
+          <w:szCs w:val="26"/>
+        </w:rPr>
+      </w:pPr>
+      <w:r>
+        <w:rPr>
+          <w:rFonts w:ascii="Times New Roman" w:hAnsi="Times New Roman" w:cs="Times New Roman"/>
+          <w:b/>
+          <w:bCs/>
+          <w:sz w:val="26"/>
+          <w:szCs w:val="26"/>
         </w:rPr>
         <w:tab/>
         <w:t>Hãy dùng các Design Pattern: State, Strategy, Decorator viết bằng Java để xử lý mô phỏng trường hợp trên và đưa ra kết luận.</w:t>
@@ -339,8 +351,10 @@
       <w:r>
         <w:rPr>
           <w:rFonts w:ascii="Times New Roman" w:hAnsi="Times New Roman" w:cs="Times New Roman"/>
-          <w:sz w:val="28"/>
-          <w:szCs w:val="28"/>
+          <w:b/>
+          <w:bCs/>
+          <w:sz w:val="26"/>
+          <w:szCs w:val="26"/>
         </w:rPr>
         <w:tab/>
       </w:r>
@@ -354,15 +368,15 @@
         </w:numPr>
         <w:rPr>
           <w:rFonts w:ascii="Times New Roman" w:hAnsi="Times New Roman" w:cs="Times New Roman"/>
-          <w:sz w:val="28"/>
-          <w:szCs w:val="28"/>
-        </w:rPr>
-      </w:pPr>
-      <w:r>
-        <w:rPr>
-          <w:rFonts w:ascii="Times New Roman" w:hAnsi="Times New Roman" w:cs="Times New Roman"/>
-          <w:sz w:val="28"/>
-          <w:szCs w:val="28"/>
+          <w:sz w:val="26"/>
+          <w:szCs w:val="26"/>
+        </w:rPr>
+      </w:pPr>
+      <w:r>
+        <w:rPr>
+          <w:rFonts w:ascii="Times New Roman" w:hAnsi="Times New Roman" w:cs="Times New Roman"/>
+          <w:sz w:val="26"/>
+          <w:szCs w:val="26"/>
         </w:rPr>
         <w:t>Diagram State pattern</w:t>
       </w:r>
@@ -371,23 +385,21 @@
       <w:pPr>
         <w:rPr>
           <w:rFonts w:ascii="Times New Roman" w:hAnsi="Times New Roman" w:cs="Times New Roman"/>
-          <w:sz w:val="28"/>
-          <w:szCs w:val="28"/>
-        </w:rPr>
-      </w:pPr>
-      <w:bookmarkStart w:id="0" w:name="_GoBack"/>
-      <w:r>
-        <w:rPr>
-          <w:rFonts w:ascii="Times New Roman" w:hAnsi="Times New Roman" w:cs="Times New Roman"/>
-          <w:noProof/>
-          <w:sz w:val="28"/>
-          <w:szCs w:val="28"/>
+          <w:sz w:val="26"/>
+          <w:szCs w:val="26"/>
+        </w:rPr>
+      </w:pPr>
+      <w:r>
+        <w:rPr>
+          <w:rFonts w:ascii="Times New Roman" w:hAnsi="Times New Roman" w:cs="Times New Roman"/>
+          <w:sz w:val="26"/>
+          <w:szCs w:val="26"/>
         </w:rPr>
         <w:drawing>
-          <wp:inline distT="0" distB="0" distL="0" distR="0" wp14:anchorId="73862AD8" wp14:editId="40B68A14">
-            <wp:extent cx="5943600" cy="4432300"/>
-            <wp:effectExtent l="0" t="0" r="0" b="6350"/>
-            <wp:docPr id="1" name="Picture 1"/>
+          <wp:inline distT="0" distB="0" distL="0" distR="0" wp14:anchorId="0E214CF5" wp14:editId="7A257F4F">
+            <wp:extent cx="5943600" cy="3432810"/>
+            <wp:effectExtent l="0" t="0" r="0" b="0"/>
+            <wp:docPr id="470383858" name="Picture 1"/>
             <wp:cNvGraphicFramePr>
               <a:graphicFrameLocks xmlns:a="http://schemas.openxmlformats.org/drawingml/2006/main" noChangeAspect="1"/>
             </wp:cNvGraphicFramePr>
@@ -395,7 +407,7 @@
               <a:graphicData uri="http://schemas.openxmlformats.org/drawingml/2006/picture">
                 <pic:pic xmlns:pic="http://schemas.openxmlformats.org/drawingml/2006/picture">
                   <pic:nvPicPr>
-                    <pic:cNvPr id="1" name=""/>
+                    <pic:cNvPr id="470383858" name=""/>
                     <pic:cNvPicPr/>
                   </pic:nvPicPr>
                   <pic:blipFill>
@@ -407,7 +419,7 @@
                   <pic:spPr>
                     <a:xfrm>
                       <a:off x="0" y="0"/>
-                      <a:ext cx="5943600" cy="4432300"/>
+                      <a:ext cx="5943600" cy="3432810"/>
                     </a:xfrm>
                     <a:prstGeom prst="rect">
                       <a:avLst/>
@@ -419,7 +431,6 @@
           </wp:inline>
         </w:drawing>
       </w:r>
-      <w:bookmarkEnd w:id="0"/>
     </w:p>
     <w:p>
       <w:pPr>
@@ -430,15 +441,15 @@
         </w:numPr>
         <w:rPr>
           <w:rFonts w:ascii="Times New Roman" w:hAnsi="Times New Roman" w:cs="Times New Roman"/>
-          <w:sz w:val="28"/>
-          <w:szCs w:val="28"/>
-        </w:rPr>
-      </w:pPr>
-      <w:r>
-        <w:rPr>
-          <w:rFonts w:ascii="Times New Roman" w:hAnsi="Times New Roman" w:cs="Times New Roman"/>
-          <w:sz w:val="28"/>
-          <w:szCs w:val="28"/>
+          <w:sz w:val="26"/>
+          <w:szCs w:val="26"/>
+        </w:rPr>
+      </w:pPr>
+      <w:r>
+        <w:rPr>
+          <w:rFonts w:ascii="Times New Roman" w:hAnsi="Times New Roman" w:cs="Times New Roman"/>
+          <w:sz w:val="26"/>
+          <w:szCs w:val="26"/>
         </w:rPr>
         <w:t>Diagram Strategy pattern</w:t>
       </w:r>
@@ -448,10 +459,53 @@
         <w:pStyle w:val="ListParagraph"/>
         <w:rPr>
           <w:rFonts w:ascii="Times New Roman" w:hAnsi="Times New Roman" w:cs="Times New Roman"/>
-          <w:sz w:val="28"/>
-          <w:szCs w:val="28"/>
-        </w:rPr>
-      </w:pPr>
+          <w:sz w:val="26"/>
+          <w:szCs w:val="26"/>
+        </w:rPr>
+      </w:pPr>
+      <w:r>
+        <w:rPr>
+          <w:rFonts w:ascii="Times New Roman" w:hAnsi="Times New Roman" w:cs="Times New Roman"/>
+          <w:sz w:val="26"/>
+          <w:szCs w:val="26"/>
+        </w:rPr>
+        <w:lastRenderedPageBreak/>
+        <w:drawing>
+          <wp:inline distT="0" distB="0" distL="0" distR="0" wp14:anchorId="1D84A32F" wp14:editId="3EBDFE34">
+            <wp:extent cx="5943600" cy="4358640"/>
+            <wp:effectExtent l="0" t="0" r="0" b="3810"/>
+            <wp:docPr id="916821268" name="Picture 1"/>
+            <wp:cNvGraphicFramePr>
+              <a:graphicFrameLocks xmlns:a="http://schemas.openxmlformats.org/drawingml/2006/main" noChangeAspect="1"/>
+            </wp:cNvGraphicFramePr>
+            <a:graphic xmlns:a="http://schemas.openxmlformats.org/drawingml/2006/main">
+              <a:graphicData uri="http://schemas.openxmlformats.org/drawingml/2006/picture">
+                <pic:pic xmlns:pic="http://schemas.openxmlformats.org/drawingml/2006/picture">
+                  <pic:nvPicPr>
+                    <pic:cNvPr id="916821268" name=""/>
+                    <pic:cNvPicPr/>
+                  </pic:nvPicPr>
+                  <pic:blipFill>
+                    <a:blip r:embed="rId6"/>
+                    <a:stretch>
+                      <a:fillRect/>
+                    </a:stretch>
+                  </pic:blipFill>
+                  <pic:spPr>
+                    <a:xfrm>
+                      <a:off x="0" y="0"/>
+                      <a:ext cx="5943600" cy="4358640"/>
+                    </a:xfrm>
+                    <a:prstGeom prst="rect">
+                      <a:avLst/>
+                    </a:prstGeom>
+                  </pic:spPr>
+                </pic:pic>
+              </a:graphicData>
+            </a:graphic>
+          </wp:inline>
+        </w:drawing>
+      </w:r>
     </w:p>
     <w:p>
       <w:pPr>
@@ -462,15 +516,15 @@
         </w:numPr>
         <w:rPr>
           <w:rFonts w:ascii="Times New Roman" w:hAnsi="Times New Roman" w:cs="Times New Roman"/>
-          <w:sz w:val="28"/>
-          <w:szCs w:val="28"/>
-        </w:rPr>
-      </w:pPr>
-      <w:r>
-        <w:rPr>
-          <w:rFonts w:ascii="Times New Roman" w:hAnsi="Times New Roman" w:cs="Times New Roman"/>
-          <w:sz w:val="28"/>
-          <w:szCs w:val="28"/>
+          <w:sz w:val="26"/>
+          <w:szCs w:val="26"/>
+        </w:rPr>
+      </w:pPr>
+      <w:r>
+        <w:rPr>
+          <w:rFonts w:ascii="Times New Roman" w:hAnsi="Times New Roman" w:cs="Times New Roman"/>
+          <w:sz w:val="26"/>
+          <w:szCs w:val="26"/>
         </w:rPr>
         <w:t>Diagram Decorator pattern</w:t>
       </w:r>
@@ -480,8 +534,8 @@
         <w:pStyle w:val="ListParagraph"/>
         <w:rPr>
           <w:rFonts w:ascii="Times New Roman" w:hAnsi="Times New Roman" w:cs="Times New Roman"/>
-          <w:sz w:val="28"/>
-          <w:szCs w:val="28"/>
+          <w:sz w:val="26"/>
+          <w:szCs w:val="26"/>
         </w:rPr>
       </w:pPr>
     </w:p>
@@ -490,10 +544,52 @@
         <w:pStyle w:val="ListParagraph"/>
         <w:rPr>
           <w:rFonts w:ascii="Times New Roman" w:hAnsi="Times New Roman" w:cs="Times New Roman"/>
-          <w:sz w:val="28"/>
-          <w:szCs w:val="28"/>
-        </w:rPr>
-      </w:pPr>
+          <w:sz w:val="26"/>
+          <w:szCs w:val="26"/>
+        </w:rPr>
+      </w:pPr>
+      <w:r>
+        <w:rPr>
+          <w:rFonts w:ascii="Times New Roman" w:hAnsi="Times New Roman" w:cs="Times New Roman"/>
+          <w:sz w:val="26"/>
+          <w:szCs w:val="26"/>
+        </w:rPr>
+        <w:drawing>
+          <wp:inline distT="0" distB="0" distL="0" distR="0" wp14:anchorId="6094F165" wp14:editId="4CFD8A47">
+            <wp:extent cx="5744377" cy="5801535"/>
+            <wp:effectExtent l="0" t="0" r="8890" b="8890"/>
+            <wp:docPr id="1548483689" name="Picture 1"/>
+            <wp:cNvGraphicFramePr>
+              <a:graphicFrameLocks xmlns:a="http://schemas.openxmlformats.org/drawingml/2006/main" noChangeAspect="1"/>
+            </wp:cNvGraphicFramePr>
+            <a:graphic xmlns:a="http://schemas.openxmlformats.org/drawingml/2006/main">
+              <a:graphicData uri="http://schemas.openxmlformats.org/drawingml/2006/picture">
+                <pic:pic xmlns:pic="http://schemas.openxmlformats.org/drawingml/2006/picture">
+                  <pic:nvPicPr>
+                    <pic:cNvPr id="1548483689" name=""/>
+                    <pic:cNvPicPr/>
+                  </pic:nvPicPr>
+                  <pic:blipFill>
+                    <a:blip r:embed="rId7"/>
+                    <a:stretch>
+                      <a:fillRect/>
+                    </a:stretch>
+                  </pic:blipFill>
+                  <pic:spPr>
+                    <a:xfrm>
+                      <a:off x="0" y="0"/>
+                      <a:ext cx="5744377" cy="5801535"/>
+                    </a:xfrm>
+                    <a:prstGeom prst="rect">
+                      <a:avLst/>
+                    </a:prstGeom>
+                  </pic:spPr>
+                </pic:pic>
+              </a:graphicData>
+            </a:graphic>
+          </wp:inline>
+        </w:drawing>
+      </w:r>
     </w:p>
     <w:p>
       <w:pPr>
@@ -504,15 +600,15 @@
         </w:numPr>
         <w:rPr>
           <w:rFonts w:ascii="Times New Roman" w:hAnsi="Times New Roman" w:cs="Times New Roman"/>
-          <w:sz w:val="28"/>
-          <w:szCs w:val="28"/>
-        </w:rPr>
-      </w:pPr>
-      <w:r>
-        <w:rPr>
-          <w:rFonts w:ascii="Times New Roman" w:hAnsi="Times New Roman" w:cs="Times New Roman"/>
-          <w:sz w:val="28"/>
-          <w:szCs w:val="28"/>
+          <w:sz w:val="26"/>
+          <w:szCs w:val="26"/>
+        </w:rPr>
+      </w:pPr>
+      <w:r>
+        <w:rPr>
+          <w:rFonts w:ascii="Times New Roman" w:hAnsi="Times New Roman" w:cs="Times New Roman"/>
+          <w:sz w:val="26"/>
+          <w:szCs w:val="26"/>
         </w:rPr>
         <w:t>Kết luận</w:t>
       </w:r>
@@ -523,109 +619,882 @@
         <w:ind w:left="360"/>
         <w:rPr>
           <w:rFonts w:ascii="Times New Roman" w:hAnsi="Times New Roman" w:cs="Times New Roman"/>
-          <w:sz w:val="28"/>
-          <w:szCs w:val="28"/>
-        </w:rPr>
-      </w:pPr>
+          <w:sz w:val="26"/>
+          <w:szCs w:val="26"/>
+        </w:rPr>
+      </w:pPr>
+    </w:p>
+    <w:tbl>
+      <w:tblPr>
+        <w:tblStyle w:val="TableGrid"/>
+        <w:tblW w:w="0" w:type="auto"/>
+        <w:tblLook w:val="04A0" w:firstRow="1" w:lastRow="0" w:firstColumn="1" w:lastColumn="0" w:noHBand="0" w:noVBand="1"/>
+      </w:tblPr>
+      <w:tblGrid>
+        <w:gridCol w:w="2337"/>
+        <w:gridCol w:w="2337"/>
+        <w:gridCol w:w="2338"/>
+        <w:gridCol w:w="2338"/>
+      </w:tblGrid>
+      <w:tr>
+        <w:tc>
+          <w:tcPr>
+            <w:tcW w:w="2337" w:type="dxa"/>
+          </w:tcPr>
+          <w:p>
+            <w:pPr>
+              <w:pStyle w:val="ListParagraph"/>
+              <w:ind w:left="0"/>
+              <w:rPr>
+                <w:rFonts w:ascii="Times New Roman" w:hAnsi="Times New Roman" w:cs="Times New Roman"/>
+                <w:sz w:val="26"/>
+                <w:szCs w:val="26"/>
+              </w:rPr>
+            </w:pPr>
+          </w:p>
+        </w:tc>
+        <w:tc>
+          <w:tcPr>
+            <w:tcW w:w="2337" w:type="dxa"/>
+          </w:tcPr>
+          <w:p>
+            <w:pPr>
+              <w:pStyle w:val="ListParagraph"/>
+              <w:ind w:left="0"/>
+              <w:rPr>
+                <w:rFonts w:ascii="Times New Roman" w:hAnsi="Times New Roman" w:cs="Times New Roman"/>
+                <w:sz w:val="26"/>
+                <w:szCs w:val="26"/>
+              </w:rPr>
+            </w:pPr>
+            <w:r>
+              <w:rPr>
+                <w:rFonts w:ascii="Times New Roman" w:hAnsi="Times New Roman" w:cs="Times New Roman"/>
+                <w:sz w:val="26"/>
+                <w:szCs w:val="26"/>
+              </w:rPr>
+              <w:t>Ưu điểm</w:t>
+            </w:r>
+          </w:p>
+        </w:tc>
+        <w:tc>
+          <w:tcPr>
+            <w:tcW w:w="2338" w:type="dxa"/>
+          </w:tcPr>
+          <w:p>
+            <w:pPr>
+              <w:pStyle w:val="ListParagraph"/>
+              <w:ind w:left="0"/>
+              <w:rPr>
+                <w:rFonts w:ascii="Times New Roman" w:hAnsi="Times New Roman" w:cs="Times New Roman"/>
+                <w:sz w:val="26"/>
+                <w:szCs w:val="26"/>
+              </w:rPr>
+            </w:pPr>
+            <w:r>
+              <w:rPr>
+                <w:rFonts w:ascii="Times New Roman" w:hAnsi="Times New Roman" w:cs="Times New Roman"/>
+                <w:sz w:val="26"/>
+                <w:szCs w:val="26"/>
+              </w:rPr>
+              <w:t>Nhược điểm</w:t>
+            </w:r>
+          </w:p>
+        </w:tc>
+        <w:tc>
+          <w:tcPr>
+            <w:tcW w:w="2338" w:type="dxa"/>
+          </w:tcPr>
+          <w:p>
+            <w:pPr>
+              <w:pStyle w:val="ListParagraph"/>
+              <w:ind w:left="0"/>
+              <w:rPr>
+                <w:rFonts w:ascii="Times New Roman" w:hAnsi="Times New Roman" w:cs="Times New Roman"/>
+                <w:sz w:val="26"/>
+                <w:szCs w:val="26"/>
+              </w:rPr>
+            </w:pPr>
+            <w:r>
+              <w:rPr>
+                <w:rFonts w:ascii="Times New Roman" w:hAnsi="Times New Roman" w:cs="Times New Roman"/>
+                <w:sz w:val="26"/>
+                <w:szCs w:val="26"/>
+              </w:rPr>
+              <w:t>P</w:t>
+            </w:r>
+            <w:r>
+              <w:rPr>
+                <w:rFonts w:ascii="Times New Roman" w:hAnsi="Times New Roman" w:cs="Times New Roman"/>
+                <w:sz w:val="26"/>
+                <w:szCs w:val="26"/>
+              </w:rPr>
+              <w:t>hù hợp</w:t>
+            </w:r>
+          </w:p>
+        </w:tc>
+      </w:tr>
+      <w:tr>
+        <w:tc>
+          <w:tcPr>
+            <w:tcW w:w="2337" w:type="dxa"/>
+          </w:tcPr>
+          <w:p>
+            <w:pPr>
+              <w:pStyle w:val="ListParagraph"/>
+              <w:ind w:left="0"/>
+              <w:rPr>
+                <w:rFonts w:ascii="Times New Roman" w:hAnsi="Times New Roman" w:cs="Times New Roman"/>
+                <w:sz w:val="26"/>
+                <w:szCs w:val="26"/>
+              </w:rPr>
+            </w:pPr>
+            <w:r>
+              <w:rPr>
+                <w:rFonts w:ascii="Times New Roman" w:hAnsi="Times New Roman" w:cs="Times New Roman"/>
+                <w:sz w:val="26"/>
+                <w:szCs w:val="26"/>
+              </w:rPr>
+              <w:t>State Pattern</w:t>
+            </w:r>
+          </w:p>
+        </w:tc>
+        <w:tc>
+          <w:tcPr>
+            <w:tcW w:w="2337" w:type="dxa"/>
+          </w:tcPr>
+          <w:p>
+            <w:pPr>
+              <w:ind w:left="-39"/>
+              <w:rPr>
+                <w:rFonts w:ascii="Times New Roman" w:hAnsi="Times New Roman" w:cs="Times New Roman"/>
+                <w:sz w:val="26"/>
+                <w:szCs w:val="26"/>
+              </w:rPr>
+            </w:pPr>
+            <w:r>
+              <w:rPr>
+                <w:rFonts w:ascii="Times New Roman" w:hAnsi="Times New Roman" w:cs="Times New Roman"/>
+                <w:sz w:val="26"/>
+                <w:szCs w:val="26"/>
+                <w:lang w:val="vi-VN"/>
+              </w:rPr>
+              <w:t>-</w:t>
+            </w:r>
+            <w:r>
+              <w:rPr>
+                <w:rFonts w:ascii="Times New Roman" w:hAnsi="Times New Roman" w:cs="Times New Roman"/>
+                <w:sz w:val="26"/>
+                <w:szCs w:val="26"/>
+              </w:rPr>
+              <w:t xml:space="preserve"> </w:t>
+            </w:r>
+            <w:r>
+              <w:rPr>
+                <w:rFonts w:ascii="Times New Roman" w:hAnsi="Times New Roman" w:cs="Times New Roman"/>
+                <w:sz w:val="26"/>
+                <w:szCs w:val="26"/>
+              </w:rPr>
+              <w:t>Mô hình hóa đúng bản chất bài toán: đơn hàng có nhiều trạng thái</w:t>
+            </w:r>
+          </w:p>
+          <w:p>
+            <w:pPr>
+              <w:pStyle w:val="ListParagraph"/>
+              <w:ind w:left="-39"/>
+              <w:rPr>
+                <w:rFonts w:ascii="Times New Roman" w:hAnsi="Times New Roman" w:cs="Times New Roman"/>
+                <w:sz w:val="26"/>
+                <w:szCs w:val="26"/>
+                <w:lang w:val="vi-VN"/>
+              </w:rPr>
+            </w:pPr>
+            <w:r>
+              <w:rPr>
+                <w:rFonts w:ascii="Times New Roman" w:hAnsi="Times New Roman" w:cs="Times New Roman"/>
+                <w:sz w:val="26"/>
+                <w:szCs w:val="26"/>
+                <w:lang w:val="vi-VN"/>
+              </w:rPr>
+              <w:t xml:space="preserve">- </w:t>
+            </w:r>
+            <w:r>
+              <w:rPr>
+                <w:rFonts w:ascii="Times New Roman" w:hAnsi="Times New Roman" w:cs="Times New Roman"/>
+                <w:sz w:val="26"/>
+                <w:szCs w:val="26"/>
+              </w:rPr>
+              <w:t>Mỗi trạng thái có</w:t>
+            </w:r>
+            <w:r>
+              <w:rPr>
+                <w:rFonts w:ascii="Times New Roman" w:hAnsi="Times New Roman" w:cs="Times New Roman"/>
+                <w:sz w:val="26"/>
+                <w:szCs w:val="26"/>
+                <w:lang w:val="vi-VN"/>
+              </w:rPr>
+              <w:t xml:space="preserve"> </w:t>
+            </w:r>
+          </w:p>
+          <w:p>
+            <w:pPr>
+              <w:pStyle w:val="ListParagraph"/>
+              <w:ind w:left="-39"/>
+              <w:rPr>
+                <w:rFonts w:ascii="Times New Roman" w:hAnsi="Times New Roman" w:cs="Times New Roman"/>
+                <w:sz w:val="26"/>
+                <w:szCs w:val="26"/>
+                <w:lang w:val="vi-VN"/>
+              </w:rPr>
+            </w:pPr>
+            <w:r>
+              <w:rPr>
+                <w:rFonts w:ascii="Times New Roman" w:hAnsi="Times New Roman" w:cs="Times New Roman"/>
+                <w:sz w:val="26"/>
+                <w:szCs w:val="26"/>
+              </w:rPr>
+              <w:t>hành vi riêng</w:t>
+            </w:r>
+            <w:r>
+              <w:rPr>
+                <w:rFonts w:ascii="Times New Roman" w:hAnsi="Times New Roman" w:cs="Times New Roman"/>
+                <w:sz w:val="26"/>
+                <w:szCs w:val="26"/>
+                <w:lang w:val="vi-VN"/>
+              </w:rPr>
+              <w:t xml:space="preserve"> và</w:t>
+            </w:r>
+          </w:p>
+          <w:p>
+            <w:pPr>
+              <w:pStyle w:val="ListParagraph"/>
+              <w:ind w:left="-39"/>
+              <w:rPr>
+                <w:rFonts w:ascii="Times New Roman" w:hAnsi="Times New Roman" w:cs="Times New Roman"/>
+                <w:sz w:val="26"/>
+                <w:szCs w:val="26"/>
+              </w:rPr>
+            </w:pPr>
+            <w:r>
+              <w:rPr>
+                <w:rFonts w:ascii="Times New Roman" w:hAnsi="Times New Roman" w:cs="Times New Roman"/>
+                <w:sz w:val="26"/>
+                <w:szCs w:val="26"/>
+              </w:rPr>
+              <w:t>logic chuyển trạng thái riêng</w:t>
+            </w:r>
+          </w:p>
+          <w:p>
+            <w:pPr>
+              <w:pStyle w:val="ListParagraph"/>
+              <w:ind w:left="-39"/>
+              <w:rPr>
+                <w:rFonts w:ascii="Times New Roman" w:hAnsi="Times New Roman" w:cs="Times New Roman"/>
+                <w:sz w:val="26"/>
+                <w:szCs w:val="26"/>
+              </w:rPr>
+            </w:pPr>
+            <w:r>
+              <w:rPr>
+                <w:rFonts w:ascii="Times New Roman" w:hAnsi="Times New Roman" w:cs="Times New Roman"/>
+                <w:sz w:val="26"/>
+                <w:szCs w:val="26"/>
+                <w:lang w:val="vi-VN"/>
+              </w:rPr>
+              <w:t xml:space="preserve">- </w:t>
+            </w:r>
+            <w:r>
+              <w:rPr>
+                <w:rFonts w:ascii="Times New Roman" w:hAnsi="Times New Roman" w:cs="Times New Roman"/>
+                <w:sz w:val="26"/>
+                <w:szCs w:val="26"/>
+              </w:rPr>
+              <w:t>Tránh if-else phức tạp</w:t>
+            </w:r>
+          </w:p>
+          <w:p>
+            <w:pPr>
+              <w:pStyle w:val="ListParagraph"/>
+              <w:ind w:left="-39"/>
+              <w:rPr>
+                <w:rFonts w:ascii="Times New Roman" w:hAnsi="Times New Roman" w:cs="Times New Roman"/>
+                <w:sz w:val="26"/>
+                <w:szCs w:val="26"/>
+                <w:lang w:val="vi-VN"/>
+              </w:rPr>
+            </w:pPr>
+            <w:r>
+              <w:rPr>
+                <w:rFonts w:ascii="Times New Roman" w:hAnsi="Times New Roman" w:cs="Times New Roman"/>
+                <w:sz w:val="26"/>
+                <w:szCs w:val="26"/>
+                <w:lang w:val="vi-VN"/>
+              </w:rPr>
+              <w:t xml:space="preserve">- </w:t>
+            </w:r>
+            <w:r>
+              <w:rPr>
+                <w:rFonts w:ascii="Times New Roman" w:hAnsi="Times New Roman" w:cs="Times New Roman"/>
+                <w:sz w:val="26"/>
+                <w:szCs w:val="26"/>
+              </w:rPr>
+              <w:t>Dễ mở rộng</w:t>
+            </w:r>
+          </w:p>
+        </w:tc>
+        <w:tc>
+          <w:tcPr>
+            <w:tcW w:w="2338" w:type="dxa"/>
+          </w:tcPr>
+          <w:p>
+            <w:pPr>
+              <w:pStyle w:val="ListParagraph"/>
+              <w:ind w:left="33"/>
+              <w:rPr>
+                <w:rFonts w:ascii="Times New Roman" w:hAnsi="Times New Roman" w:cs="Times New Roman"/>
+                <w:sz w:val="26"/>
+                <w:szCs w:val="26"/>
+              </w:rPr>
+            </w:pPr>
+            <w:r>
+              <w:rPr>
+                <w:rFonts w:ascii="Times New Roman" w:hAnsi="Times New Roman" w:cs="Times New Roman"/>
+                <w:sz w:val="26"/>
+                <w:szCs w:val="26"/>
+                <w:lang w:val="vi-VN"/>
+              </w:rPr>
+              <w:t xml:space="preserve">- </w:t>
+            </w:r>
+            <w:r>
+              <w:rPr>
+                <w:rFonts w:ascii="Times New Roman" w:hAnsi="Times New Roman" w:cs="Times New Roman"/>
+                <w:sz w:val="26"/>
+                <w:szCs w:val="26"/>
+              </w:rPr>
+              <w:t>Số lượng class tăng</w:t>
+            </w:r>
+          </w:p>
+          <w:p>
+            <w:pPr>
+              <w:pStyle w:val="ListParagraph"/>
+              <w:ind w:left="0"/>
+              <w:rPr>
+                <w:rFonts w:ascii="Times New Roman" w:hAnsi="Times New Roman" w:cs="Times New Roman"/>
+                <w:sz w:val="26"/>
+                <w:szCs w:val="26"/>
+              </w:rPr>
+            </w:pPr>
+            <w:r>
+              <w:rPr>
+                <w:rFonts w:ascii="Times New Roman" w:hAnsi="Times New Roman" w:cs="Times New Roman"/>
+                <w:sz w:val="26"/>
+                <w:szCs w:val="26"/>
+                <w:lang w:val="vi-VN"/>
+              </w:rPr>
+              <w:t xml:space="preserve">- </w:t>
+            </w:r>
+            <w:r>
+              <w:rPr>
+                <w:rFonts w:ascii="Times New Roman" w:hAnsi="Times New Roman" w:cs="Times New Roman"/>
+                <w:sz w:val="26"/>
+                <w:szCs w:val="26"/>
+              </w:rPr>
+              <w:t>Khó theo dõi luồng nếu hệ thống lớn</w:t>
+            </w:r>
+          </w:p>
+        </w:tc>
+        <w:tc>
+          <w:tcPr>
+            <w:tcW w:w="2338" w:type="dxa"/>
+          </w:tcPr>
+          <w:p>
+            <w:pPr>
+              <w:pStyle w:val="ListParagraph"/>
+              <w:ind w:left="0"/>
+              <w:rPr>
+                <w:rFonts w:ascii="Times New Roman" w:hAnsi="Times New Roman" w:cs="Times New Roman"/>
+                <w:sz w:val="26"/>
+                <w:szCs w:val="26"/>
+              </w:rPr>
+            </w:pPr>
+            <w:r>
+              <w:rPr>
+                <w:rFonts w:ascii="Times New Roman" w:hAnsi="Times New Roman" w:cs="Times New Roman"/>
+                <w:sz w:val="26"/>
+                <w:szCs w:val="26"/>
+              </w:rPr>
+              <w:t>Có</w:t>
+            </w:r>
+          </w:p>
+        </w:tc>
+      </w:tr>
+      <w:tr>
+        <w:tc>
+          <w:tcPr>
+            <w:tcW w:w="2337" w:type="dxa"/>
+          </w:tcPr>
+          <w:p>
+            <w:pPr>
+              <w:pStyle w:val="ListParagraph"/>
+              <w:ind w:left="0"/>
+              <w:rPr>
+                <w:rFonts w:ascii="Times New Roman" w:hAnsi="Times New Roman" w:cs="Times New Roman"/>
+                <w:sz w:val="26"/>
+                <w:szCs w:val="26"/>
+              </w:rPr>
+            </w:pPr>
+            <w:r>
+              <w:rPr>
+                <w:rFonts w:ascii="Times New Roman" w:hAnsi="Times New Roman" w:cs="Times New Roman"/>
+                <w:sz w:val="26"/>
+                <w:szCs w:val="26"/>
+              </w:rPr>
+              <w:t>Strategy Pattern</w:t>
+            </w:r>
+          </w:p>
+        </w:tc>
+        <w:tc>
+          <w:tcPr>
+            <w:tcW w:w="2337" w:type="dxa"/>
+          </w:tcPr>
+          <w:p>
+            <w:pPr>
+              <w:pStyle w:val="ListParagraph"/>
+              <w:ind w:left="0"/>
+              <w:rPr>
+                <w:rFonts w:ascii="Times New Roman" w:hAnsi="Times New Roman" w:cs="Times New Roman"/>
+                <w:sz w:val="26"/>
+                <w:szCs w:val="26"/>
+                <w:lang w:val="vi-VN"/>
+              </w:rPr>
+            </w:pPr>
+            <w:r>
+              <w:rPr>
+                <w:rFonts w:ascii="Times New Roman" w:hAnsi="Times New Roman" w:cs="Times New Roman"/>
+                <w:sz w:val="26"/>
+                <w:szCs w:val="26"/>
+                <w:lang w:val="vi-VN"/>
+              </w:rPr>
+              <w:t xml:space="preserve">- </w:t>
+            </w:r>
+            <w:r>
+              <w:rPr>
+                <w:rFonts w:ascii="Times New Roman" w:hAnsi="Times New Roman" w:cs="Times New Roman"/>
+                <w:sz w:val="26"/>
+                <w:szCs w:val="26"/>
+              </w:rPr>
+              <w:t>Tách các hành vi thành các chiến lược độc lập</w:t>
+            </w:r>
+          </w:p>
+          <w:p>
+            <w:pPr>
+              <w:pStyle w:val="ListParagraph"/>
+              <w:ind w:left="0"/>
+              <w:rPr>
+                <w:rFonts w:ascii="Times New Roman" w:hAnsi="Times New Roman" w:cs="Times New Roman"/>
+                <w:sz w:val="26"/>
+                <w:szCs w:val="26"/>
+                <w:lang w:val="vi-VN"/>
+              </w:rPr>
+            </w:pPr>
+            <w:r>
+              <w:rPr>
+                <w:rFonts w:ascii="Times New Roman" w:hAnsi="Times New Roman" w:cs="Times New Roman"/>
+                <w:sz w:val="26"/>
+                <w:szCs w:val="26"/>
+                <w:lang w:val="vi-VN"/>
+              </w:rPr>
+              <w:t xml:space="preserve">- </w:t>
+            </w:r>
+            <w:r>
+              <w:rPr>
+                <w:rFonts w:ascii="Times New Roman" w:hAnsi="Times New Roman" w:cs="Times New Roman"/>
+                <w:sz w:val="26"/>
+                <w:szCs w:val="26"/>
+                <w:lang w:val="vi-VN"/>
+              </w:rPr>
+              <w:t>Có thể thay đổi hành vi runtime</w:t>
+            </w:r>
+          </w:p>
+          <w:p>
+            <w:pPr>
+              <w:pStyle w:val="ListParagraph"/>
+              <w:ind w:left="0"/>
+              <w:rPr>
+                <w:rFonts w:ascii="Times New Roman" w:hAnsi="Times New Roman" w:cs="Times New Roman"/>
+                <w:sz w:val="26"/>
+                <w:szCs w:val="26"/>
+                <w:lang w:val="vi-VN"/>
+              </w:rPr>
+            </w:pPr>
+            <w:r>
+              <w:rPr>
+                <w:rFonts w:ascii="Times New Roman" w:hAnsi="Times New Roman" w:cs="Times New Roman"/>
+                <w:sz w:val="26"/>
+                <w:szCs w:val="26"/>
+                <w:lang w:val="vi-VN"/>
+              </w:rPr>
+              <w:t xml:space="preserve">- </w:t>
+            </w:r>
+            <w:r>
+              <w:rPr>
+                <w:rFonts w:ascii="Times New Roman" w:hAnsi="Times New Roman" w:cs="Times New Roman"/>
+                <w:sz w:val="26"/>
+                <w:szCs w:val="26"/>
+                <w:lang w:val="vi-VN"/>
+              </w:rPr>
+              <w:t>Tái sử dụng tốt</w:t>
+            </w:r>
+          </w:p>
+        </w:tc>
+        <w:tc>
+          <w:tcPr>
+            <w:tcW w:w="2338" w:type="dxa"/>
+          </w:tcPr>
+          <w:p>
+            <w:pPr>
+              <w:pStyle w:val="ListParagraph"/>
+              <w:ind w:left="33"/>
+              <w:rPr>
+                <w:rFonts w:ascii="Times New Roman" w:hAnsi="Times New Roman" w:cs="Times New Roman"/>
+                <w:sz w:val="26"/>
+                <w:szCs w:val="26"/>
+              </w:rPr>
+            </w:pPr>
+            <w:r>
+              <w:rPr>
+                <w:rFonts w:ascii="Times New Roman" w:hAnsi="Times New Roman" w:cs="Times New Roman"/>
+                <w:sz w:val="26"/>
+                <w:szCs w:val="26"/>
+                <w:lang w:val="vi-VN"/>
+              </w:rPr>
+              <w:t xml:space="preserve">- </w:t>
+            </w:r>
+            <w:r>
+              <w:rPr>
+                <w:rFonts w:ascii="Times New Roman" w:hAnsi="Times New Roman" w:cs="Times New Roman"/>
+                <w:sz w:val="26"/>
+                <w:szCs w:val="26"/>
+              </w:rPr>
+              <w:t>Không quản lý trạng thái</w:t>
+            </w:r>
+          </w:p>
+          <w:p>
+            <w:pPr>
+              <w:pStyle w:val="ListParagraph"/>
+              <w:ind w:left="0"/>
+              <w:rPr>
+                <w:rFonts w:ascii="Times New Roman" w:hAnsi="Times New Roman" w:cs="Times New Roman"/>
+                <w:sz w:val="26"/>
+                <w:szCs w:val="26"/>
+              </w:rPr>
+            </w:pPr>
+            <w:r>
+              <w:rPr>
+                <w:rFonts w:ascii="Times New Roman" w:hAnsi="Times New Roman" w:cs="Times New Roman"/>
+                <w:sz w:val="26"/>
+                <w:szCs w:val="26"/>
+                <w:lang w:val="vi-VN"/>
+              </w:rPr>
+              <w:t xml:space="preserve">- </w:t>
+            </w:r>
+            <w:r>
+              <w:rPr>
+                <w:rFonts w:ascii="Times New Roman" w:hAnsi="Times New Roman" w:cs="Times New Roman"/>
+                <w:sz w:val="26"/>
+                <w:szCs w:val="26"/>
+              </w:rPr>
+              <w:t>Người dùng phải tự chọn strategy dễ sai logic nghiệp vụ</w:t>
+            </w:r>
+          </w:p>
+        </w:tc>
+        <w:tc>
+          <w:tcPr>
+            <w:tcW w:w="2338" w:type="dxa"/>
+          </w:tcPr>
+          <w:p>
+            <w:pPr>
+              <w:pStyle w:val="ListParagraph"/>
+              <w:ind w:left="0"/>
+              <w:rPr>
+                <w:rFonts w:ascii="Times New Roman" w:hAnsi="Times New Roman" w:cs="Times New Roman"/>
+                <w:sz w:val="26"/>
+                <w:szCs w:val="26"/>
+              </w:rPr>
+            </w:pPr>
+            <w:r>
+              <w:rPr>
+                <w:rFonts w:ascii="Times New Roman" w:hAnsi="Times New Roman" w:cs="Times New Roman"/>
+                <w:sz w:val="26"/>
+                <w:szCs w:val="26"/>
+              </w:rPr>
+              <w:t>Không</w:t>
+            </w:r>
+          </w:p>
+        </w:tc>
+      </w:tr>
+      <w:tr>
+        <w:tc>
+          <w:tcPr>
+            <w:tcW w:w="2337" w:type="dxa"/>
+          </w:tcPr>
+          <w:p>
+            <w:pPr>
+              <w:pStyle w:val="ListParagraph"/>
+              <w:ind w:left="0"/>
+              <w:rPr>
+                <w:rFonts w:ascii="Times New Roman" w:hAnsi="Times New Roman" w:cs="Times New Roman"/>
+                <w:sz w:val="26"/>
+                <w:szCs w:val="26"/>
+              </w:rPr>
+            </w:pPr>
+            <w:r>
+              <w:rPr>
+                <w:rFonts w:ascii="Times New Roman" w:hAnsi="Times New Roman" w:cs="Times New Roman"/>
+                <w:sz w:val="26"/>
+                <w:szCs w:val="26"/>
+              </w:rPr>
+              <w:t>Decorator Pattern</w:t>
+            </w:r>
+          </w:p>
+        </w:tc>
+        <w:tc>
+          <w:tcPr>
+            <w:tcW w:w="2337" w:type="dxa"/>
+          </w:tcPr>
+          <w:p>
+            <w:pPr>
+              <w:pStyle w:val="ListParagraph"/>
+              <w:ind w:left="0"/>
+              <w:rPr>
+                <w:rFonts w:ascii="Times New Roman" w:hAnsi="Times New Roman" w:cs="Times New Roman"/>
+                <w:sz w:val="26"/>
+                <w:szCs w:val="26"/>
+              </w:rPr>
+            </w:pPr>
+            <w:r>
+              <w:rPr>
+                <w:rFonts w:ascii="Times New Roman" w:hAnsi="Times New Roman" w:cs="Times New Roman"/>
+                <w:sz w:val="26"/>
+                <w:szCs w:val="26"/>
+                <w:lang w:val="vi-VN"/>
+              </w:rPr>
+              <w:t xml:space="preserve">- </w:t>
+            </w:r>
+            <w:r>
+              <w:rPr>
+                <w:rFonts w:ascii="Times New Roman" w:hAnsi="Times New Roman" w:cs="Times New Roman"/>
+                <w:sz w:val="26"/>
+                <w:szCs w:val="26"/>
+              </w:rPr>
+              <w:t>Mở rộng chức năng mà không sửa class gốc</w:t>
+            </w:r>
+          </w:p>
+          <w:p>
+            <w:pPr>
+              <w:pStyle w:val="ListParagraph"/>
+              <w:ind w:left="0"/>
+              <w:rPr>
+                <w:rFonts w:ascii="Times New Roman" w:hAnsi="Times New Roman" w:cs="Times New Roman"/>
+                <w:sz w:val="26"/>
+                <w:szCs w:val="26"/>
+              </w:rPr>
+            </w:pPr>
+            <w:r>
+              <w:rPr>
+                <w:rFonts w:ascii="Times New Roman" w:hAnsi="Times New Roman" w:cs="Times New Roman"/>
+                <w:sz w:val="26"/>
+                <w:szCs w:val="26"/>
+                <w:lang w:val="vi-VN"/>
+              </w:rPr>
+              <w:t xml:space="preserve">- </w:t>
+            </w:r>
+            <w:r>
+              <w:rPr>
+                <w:rFonts w:ascii="Times New Roman" w:hAnsi="Times New Roman" w:cs="Times New Roman"/>
+                <w:sz w:val="26"/>
+                <w:szCs w:val="26"/>
+              </w:rPr>
+              <w:t>Linh hoạt, kết hợp nhiều decorator</w:t>
+            </w:r>
+          </w:p>
+        </w:tc>
+        <w:tc>
+          <w:tcPr>
+            <w:tcW w:w="2338" w:type="dxa"/>
+          </w:tcPr>
+          <w:p>
+            <w:pPr>
+              <w:pStyle w:val="ListParagraph"/>
+              <w:ind w:left="0"/>
+              <w:rPr>
+                <w:rFonts w:ascii="Times New Roman" w:hAnsi="Times New Roman" w:cs="Times New Roman"/>
+                <w:sz w:val="26"/>
+                <w:szCs w:val="26"/>
+              </w:rPr>
+            </w:pPr>
+            <w:r>
+              <w:rPr>
+                <w:rFonts w:ascii="Times New Roman" w:hAnsi="Times New Roman" w:cs="Times New Roman"/>
+                <w:sz w:val="26"/>
+                <w:szCs w:val="26"/>
+                <w:lang w:val="vi-VN"/>
+              </w:rPr>
+              <w:t xml:space="preserve">- </w:t>
+            </w:r>
+            <w:r>
+              <w:rPr>
+                <w:rFonts w:ascii="Times New Roman" w:hAnsi="Times New Roman" w:cs="Times New Roman"/>
+                <w:sz w:val="26"/>
+                <w:szCs w:val="26"/>
+              </w:rPr>
+              <w:t>Nhiều lớp wrapper khó đọc</w:t>
+            </w:r>
+          </w:p>
+          <w:p>
+            <w:pPr>
+              <w:pStyle w:val="ListParagraph"/>
+              <w:ind w:left="0"/>
+              <w:rPr>
+                <w:rFonts w:ascii="Times New Roman" w:hAnsi="Times New Roman" w:cs="Times New Roman"/>
+                <w:sz w:val="26"/>
+                <w:szCs w:val="26"/>
+              </w:rPr>
+            </w:pPr>
+            <w:r>
+              <w:rPr>
+                <w:rFonts w:ascii="Times New Roman" w:hAnsi="Times New Roman" w:cs="Times New Roman"/>
+                <w:sz w:val="26"/>
+                <w:szCs w:val="26"/>
+                <w:lang w:val="vi-VN"/>
+              </w:rPr>
+              <w:t xml:space="preserve">- </w:t>
+            </w:r>
+            <w:r>
+              <w:rPr>
+                <w:rFonts w:ascii="Times New Roman" w:hAnsi="Times New Roman" w:cs="Times New Roman"/>
+                <w:sz w:val="26"/>
+                <w:szCs w:val="26"/>
+              </w:rPr>
+              <w:t>Không liên quan trực tiếp đến trạng thái</w:t>
+            </w:r>
+          </w:p>
+        </w:tc>
+        <w:tc>
+          <w:tcPr>
+            <w:tcW w:w="2338" w:type="dxa"/>
+          </w:tcPr>
+          <w:p>
+            <w:pPr>
+              <w:pStyle w:val="ListParagraph"/>
+              <w:ind w:left="0"/>
+              <w:rPr>
+                <w:rFonts w:ascii="Times New Roman" w:hAnsi="Times New Roman" w:cs="Times New Roman"/>
+                <w:sz w:val="26"/>
+                <w:szCs w:val="26"/>
+              </w:rPr>
+            </w:pPr>
+            <w:r>
+              <w:rPr>
+                <w:rFonts w:ascii="Times New Roman" w:hAnsi="Times New Roman" w:cs="Times New Roman"/>
+                <w:sz w:val="26"/>
+                <w:szCs w:val="26"/>
+              </w:rPr>
+              <w:t>Không</w:t>
+            </w:r>
+          </w:p>
+        </w:tc>
+      </w:tr>
+    </w:tbl>
+    <w:p>
+      <w:pPr>
+        <w:pStyle w:val="ListParagraph"/>
+        <w:ind w:left="0"/>
+        <w:rPr>
+          <w:rFonts w:ascii="Times New Roman" w:hAnsi="Times New Roman" w:cs="Times New Roman"/>
+          <w:sz w:val="26"/>
+          <w:szCs w:val="26"/>
+          <w:lang w:val="vi-VN"/>
+        </w:rPr>
+      </w:pPr>
+      <w:r>
+        <w:rPr>
+          <w:rFonts w:ascii="Times New Roman" w:hAnsi="Times New Roman" w:cs="Times New Roman"/>
+          <w:sz w:val="26"/>
+          <w:szCs w:val="26"/>
+        </w:rPr>
+        <w:tab/>
+      </w:r>
     </w:p>
     <w:p>
       <w:pPr>
-        <w:pStyle w:val="ListParagraph"/>
-        <w:ind w:left="360"/>
-        <w:rPr>
-          <w:rFonts w:ascii="Times New Roman" w:hAnsi="Times New Roman" w:cs="Times New Roman"/>
-          <w:sz w:val="28"/>
-          <w:szCs w:val="28"/>
-        </w:rPr>
-      </w:pPr>
-      <w:r>
-        <w:rPr>
-          <w:rFonts w:ascii="Times New Roman" w:hAnsi="Times New Roman" w:cs="Times New Roman"/>
-          <w:sz w:val="28"/>
-          <w:szCs w:val="28"/>
-        </w:rPr>
-        <w:tab/>
+        <w:rPr>
+          <w:rFonts w:ascii="Times New Roman" w:hAnsi="Times New Roman" w:cs="Times New Roman"/>
+          <w:b/>
+          <w:bCs/>
+          <w:sz w:val="26"/>
+          <w:szCs w:val="26"/>
+        </w:rPr>
+      </w:pPr>
+      <w:r>
+        <w:rPr>
+          <w:rFonts w:ascii="Times New Roman" w:hAnsi="Times New Roman" w:cs="Times New Roman"/>
+          <w:b/>
+          <w:bCs/>
+          <w:sz w:val="26"/>
+          <w:szCs w:val="26"/>
+        </w:rPr>
+        <w:t xml:space="preserve">2. Tính toán thuế cho sản phẩm. </w:t>
       </w:r>
     </w:p>
     <w:p>
       <w:pPr>
         <w:rPr>
           <w:rFonts w:ascii="Times New Roman" w:hAnsi="Times New Roman" w:cs="Times New Roman"/>
-          <w:sz w:val="28"/>
-          <w:szCs w:val="28"/>
-        </w:rPr>
-      </w:pPr>
-      <w:r>
-        <w:rPr>
-          <w:rFonts w:ascii="Times New Roman" w:hAnsi="Times New Roman" w:cs="Times New Roman"/>
-          <w:sz w:val="28"/>
-          <w:szCs w:val="28"/>
-        </w:rPr>
-        <w:t>2. Tính toán thuế cho sản phẩm.</w:t>
-      </w:r>
-      <w:r>
-        <w:rPr>
-          <w:rFonts w:ascii="Times New Roman" w:hAnsi="Times New Roman" w:cs="Times New Roman"/>
-          <w:sz w:val="28"/>
-          <w:szCs w:val="28"/>
-        </w:rPr>
-        <w:t xml:space="preserve"> </w:t>
+          <w:b/>
+          <w:bCs/>
+          <w:sz w:val="26"/>
+          <w:szCs w:val="26"/>
+        </w:rPr>
+      </w:pPr>
+      <w:r>
+        <w:rPr>
+          <w:rFonts w:ascii="Times New Roman" w:hAnsi="Times New Roman" w:cs="Times New Roman"/>
+          <w:b/>
+          <w:bCs/>
+          <w:sz w:val="26"/>
+          <w:szCs w:val="26"/>
+        </w:rPr>
+        <w:t>Giả sử bạn có một hệ thống bán hàng và muốn tính toán thuế cho các sản phẩm khác nhau. Các sản phẩm có thể áp dụng các loại thuế khác nhau, ví dụ như thuế tiêu thụ, thuế giá trị gia tăng (VAT), hoặc thuế đặc biệt cho các sản phẩm xa xỉ.</w:t>
+      </w:r>
+      <w:r>
+        <w:rPr>
+          <w:rFonts w:ascii="Times New Roman" w:hAnsi="Times New Roman" w:cs="Times New Roman"/>
+          <w:b/>
+          <w:bCs/>
+          <w:sz w:val="26"/>
+          <w:szCs w:val="26"/>
+        </w:rPr>
+        <w:tab/>
       </w:r>
     </w:p>
     <w:p>
       <w:pPr>
         <w:rPr>
           <w:rFonts w:ascii="Times New Roman" w:hAnsi="Times New Roman" w:cs="Times New Roman"/>
-          <w:sz w:val="28"/>
-          <w:szCs w:val="28"/>
-        </w:rPr>
-      </w:pPr>
-      <w:r>
-        <w:rPr>
-          <w:rFonts w:ascii="Times New Roman" w:hAnsi="Times New Roman" w:cs="Times New Roman"/>
-          <w:sz w:val="28"/>
-          <w:szCs w:val="28"/>
-        </w:rPr>
-        <w:t>Giả sử bạn có một hệ thống bán hàng và muốn tính toán thuế cho các sản phẩm khác nhau.</w:t>
-      </w:r>
-      <w:r>
-        <w:rPr>
-          <w:rFonts w:ascii="Times New Roman" w:hAnsi="Times New Roman" w:cs="Times New Roman"/>
-          <w:sz w:val="28"/>
-          <w:szCs w:val="28"/>
-        </w:rPr>
-        <w:t xml:space="preserve"> </w:t>
-      </w:r>
-      <w:r>
-        <w:rPr>
-          <w:rFonts w:ascii="Times New Roman" w:hAnsi="Times New Roman" w:cs="Times New Roman"/>
-          <w:sz w:val="28"/>
-          <w:szCs w:val="28"/>
-        </w:rPr>
-        <w:t>Các sản phẩm có thể áp dụng các loại thuế khác nhau, ví dụ như thuế tiêu thụ, thuế giá trị gia tăng (VAT), hoặc thuế đặc biệt cho các sản phẩm xa xỉ.</w:t>
-      </w:r>
-      <w:r>
-        <w:rPr>
-          <w:rFonts w:ascii="Times New Roman" w:hAnsi="Times New Roman" w:cs="Times New Roman"/>
-          <w:sz w:val="28"/>
-          <w:szCs w:val="28"/>
-        </w:rPr>
-        <w:tab/>
-      </w:r>
-    </w:p>
-    <w:p>
-      <w:pPr>
-        <w:rPr>
-          <w:rFonts w:ascii="Times New Roman" w:hAnsi="Times New Roman" w:cs="Times New Roman"/>
-          <w:sz w:val="28"/>
-          <w:szCs w:val="28"/>
-        </w:rPr>
-      </w:pPr>
-      <w:r>
-        <w:rPr>
-          <w:rFonts w:ascii="Times New Roman" w:hAnsi="Times New Roman" w:cs="Times New Roman"/>
-          <w:sz w:val="28"/>
-          <w:szCs w:val="28"/>
+          <w:b/>
+          <w:bCs/>
+          <w:sz w:val="26"/>
+          <w:szCs w:val="26"/>
+        </w:rPr>
+      </w:pPr>
+      <w:r>
+        <w:rPr>
+          <w:rFonts w:ascii="Times New Roman" w:hAnsi="Times New Roman" w:cs="Times New Roman"/>
+          <w:b/>
+          <w:bCs/>
+          <w:sz w:val="26"/>
+          <w:szCs w:val="26"/>
         </w:rPr>
         <w:tab/>
         <w:t>Hãy dùng các Design Pattern: State, Strategy, Decorator viết bằng Java để xử lý mô phỏng trường hợp trên và đưa ra kết luận.</w:t>
@@ -633,8 +1502,10 @@
       <w:r>
         <w:rPr>
           <w:rFonts w:ascii="Times New Roman" w:hAnsi="Times New Roman" w:cs="Times New Roman"/>
-          <w:sz w:val="28"/>
-          <w:szCs w:val="28"/>
+          <w:b/>
+          <w:bCs/>
+          <w:sz w:val="26"/>
+          <w:szCs w:val="26"/>
         </w:rPr>
         <w:tab/>
       </w:r>
@@ -648,15 +1519,15 @@
         </w:numPr>
         <w:rPr>
           <w:rFonts w:ascii="Times New Roman" w:hAnsi="Times New Roman" w:cs="Times New Roman"/>
-          <w:sz w:val="28"/>
-          <w:szCs w:val="28"/>
-        </w:rPr>
-      </w:pPr>
-      <w:r>
-        <w:rPr>
-          <w:rFonts w:ascii="Times New Roman" w:hAnsi="Times New Roman" w:cs="Times New Roman"/>
-          <w:sz w:val="28"/>
-          <w:szCs w:val="28"/>
+          <w:sz w:val="26"/>
+          <w:szCs w:val="26"/>
+        </w:rPr>
+      </w:pPr>
+      <w:r>
+        <w:rPr>
+          <w:rFonts w:ascii="Times New Roman" w:hAnsi="Times New Roman" w:cs="Times New Roman"/>
+          <w:sz w:val="26"/>
+          <w:szCs w:val="26"/>
         </w:rPr>
         <w:t>Diagram State pattern</w:t>
       </w:r>
@@ -665,10 +1536,52 @@
       <w:pPr>
         <w:rPr>
           <w:rFonts w:ascii="Times New Roman" w:hAnsi="Times New Roman" w:cs="Times New Roman"/>
-          <w:sz w:val="28"/>
-          <w:szCs w:val="28"/>
-        </w:rPr>
-      </w:pPr>
+          <w:sz w:val="26"/>
+          <w:szCs w:val="26"/>
+        </w:rPr>
+      </w:pPr>
+      <w:r>
+        <w:rPr>
+          <w:rFonts w:ascii="Times New Roman" w:hAnsi="Times New Roman" w:cs="Times New Roman"/>
+          <w:sz w:val="26"/>
+          <w:szCs w:val="26"/>
+        </w:rPr>
+        <w:drawing>
+          <wp:inline distT="0" distB="0" distL="0" distR="0" wp14:anchorId="54C7FE1E" wp14:editId="176CB6B8">
+            <wp:extent cx="5544324" cy="6306430"/>
+            <wp:effectExtent l="0" t="0" r="0" b="0"/>
+            <wp:docPr id="1415478177" name="Picture 1"/>
+            <wp:cNvGraphicFramePr>
+              <a:graphicFrameLocks xmlns:a="http://schemas.openxmlformats.org/drawingml/2006/main" noChangeAspect="1"/>
+            </wp:cNvGraphicFramePr>
+            <a:graphic xmlns:a="http://schemas.openxmlformats.org/drawingml/2006/main">
+              <a:graphicData uri="http://schemas.openxmlformats.org/drawingml/2006/picture">
+                <pic:pic xmlns:pic="http://schemas.openxmlformats.org/drawingml/2006/picture">
+                  <pic:nvPicPr>
+                    <pic:cNvPr id="1415478177" name=""/>
+                    <pic:cNvPicPr/>
+                  </pic:nvPicPr>
+                  <pic:blipFill>
+                    <a:blip r:embed="rId8"/>
+                    <a:stretch>
+                      <a:fillRect/>
+                    </a:stretch>
+                  </pic:blipFill>
+                  <pic:spPr>
+                    <a:xfrm>
+                      <a:off x="0" y="0"/>
+                      <a:ext cx="5544324" cy="6306430"/>
+                    </a:xfrm>
+                    <a:prstGeom prst="rect">
+                      <a:avLst/>
+                    </a:prstGeom>
+                  </pic:spPr>
+                </pic:pic>
+              </a:graphicData>
+            </a:graphic>
+          </wp:inline>
+        </w:drawing>
+      </w:r>
     </w:p>
     <w:p>
       <w:pPr>
@@ -679,15 +1592,15 @@
         </w:numPr>
         <w:rPr>
           <w:rFonts w:ascii="Times New Roman" w:hAnsi="Times New Roman" w:cs="Times New Roman"/>
-          <w:sz w:val="28"/>
-          <w:szCs w:val="28"/>
-        </w:rPr>
-      </w:pPr>
-      <w:r>
-        <w:rPr>
-          <w:rFonts w:ascii="Times New Roman" w:hAnsi="Times New Roman" w:cs="Times New Roman"/>
-          <w:sz w:val="28"/>
-          <w:szCs w:val="28"/>
+          <w:sz w:val="26"/>
+          <w:szCs w:val="26"/>
+        </w:rPr>
+      </w:pPr>
+      <w:r>
+        <w:rPr>
+          <w:rFonts w:ascii="Times New Roman" w:hAnsi="Times New Roman" w:cs="Times New Roman"/>
+          <w:sz w:val="26"/>
+          <w:szCs w:val="26"/>
         </w:rPr>
         <w:t>Diagram Strategy pattern</w:t>
       </w:r>
@@ -697,18 +1610,60 @@
         <w:pStyle w:val="ListParagraph"/>
         <w:rPr>
           <w:rFonts w:ascii="Times New Roman" w:hAnsi="Times New Roman" w:cs="Times New Roman"/>
-          <w:sz w:val="28"/>
-          <w:szCs w:val="28"/>
-        </w:rPr>
-      </w:pPr>
+          <w:sz w:val="26"/>
+          <w:szCs w:val="26"/>
+        </w:rPr>
+      </w:pPr>
+      <w:r>
+        <w:rPr>
+          <w:rFonts w:ascii="Times New Roman" w:hAnsi="Times New Roman" w:cs="Times New Roman"/>
+          <w:sz w:val="26"/>
+          <w:szCs w:val="26"/>
+        </w:rPr>
+        <w:drawing>
+          <wp:inline distT="0" distB="0" distL="0" distR="0" wp14:anchorId="7E501C16" wp14:editId="5DF6185A">
+            <wp:extent cx="5943600" cy="3659505"/>
+            <wp:effectExtent l="0" t="0" r="0" b="0"/>
+            <wp:docPr id="1168768267" name="Picture 1"/>
+            <wp:cNvGraphicFramePr>
+              <a:graphicFrameLocks xmlns:a="http://schemas.openxmlformats.org/drawingml/2006/main" noChangeAspect="1"/>
+            </wp:cNvGraphicFramePr>
+            <a:graphic xmlns:a="http://schemas.openxmlformats.org/drawingml/2006/main">
+              <a:graphicData uri="http://schemas.openxmlformats.org/drawingml/2006/picture">
+                <pic:pic xmlns:pic="http://schemas.openxmlformats.org/drawingml/2006/picture">
+                  <pic:nvPicPr>
+                    <pic:cNvPr id="1168768267" name=""/>
+                    <pic:cNvPicPr/>
+                  </pic:nvPicPr>
+                  <pic:blipFill>
+                    <a:blip r:embed="rId9"/>
+                    <a:stretch>
+                      <a:fillRect/>
+                    </a:stretch>
+                  </pic:blipFill>
+                  <pic:spPr>
+                    <a:xfrm>
+                      <a:off x="0" y="0"/>
+                      <a:ext cx="5943600" cy="3659505"/>
+                    </a:xfrm>
+                    <a:prstGeom prst="rect">
+                      <a:avLst/>
+                    </a:prstGeom>
+                  </pic:spPr>
+                </pic:pic>
+              </a:graphicData>
+            </a:graphic>
+          </wp:inline>
+        </w:drawing>
+      </w:r>
     </w:p>
     <w:p>
       <w:pPr>
         <w:pStyle w:val="ListParagraph"/>
         <w:rPr>
           <w:rFonts w:ascii="Times New Roman" w:hAnsi="Times New Roman" w:cs="Times New Roman"/>
-          <w:sz w:val="28"/>
-          <w:szCs w:val="28"/>
+          <w:sz w:val="26"/>
+          <w:szCs w:val="26"/>
         </w:rPr>
       </w:pPr>
     </w:p>
@@ -721,15 +1676,15 @@
         </w:numPr>
         <w:rPr>
           <w:rFonts w:ascii="Times New Roman" w:hAnsi="Times New Roman" w:cs="Times New Roman"/>
-          <w:sz w:val="28"/>
-          <w:szCs w:val="28"/>
-        </w:rPr>
-      </w:pPr>
-      <w:r>
-        <w:rPr>
-          <w:rFonts w:ascii="Times New Roman" w:hAnsi="Times New Roman" w:cs="Times New Roman"/>
-          <w:sz w:val="28"/>
-          <w:szCs w:val="28"/>
+          <w:sz w:val="26"/>
+          <w:szCs w:val="26"/>
+        </w:rPr>
+      </w:pPr>
+      <w:r>
+        <w:rPr>
+          <w:rFonts w:ascii="Times New Roman" w:hAnsi="Times New Roman" w:cs="Times New Roman"/>
+          <w:sz w:val="26"/>
+          <w:szCs w:val="26"/>
         </w:rPr>
         <w:t>Diagram Decorator pattern</w:t>
       </w:r>
@@ -739,10 +1694,52 @@
         <w:pStyle w:val="ListParagraph"/>
         <w:rPr>
           <w:rFonts w:ascii="Times New Roman" w:hAnsi="Times New Roman" w:cs="Times New Roman"/>
-          <w:sz w:val="28"/>
-          <w:szCs w:val="28"/>
-        </w:rPr>
-      </w:pPr>
+          <w:sz w:val="26"/>
+          <w:szCs w:val="26"/>
+        </w:rPr>
+      </w:pPr>
+      <w:r>
+        <w:rPr>
+          <w:rFonts w:ascii="Times New Roman" w:hAnsi="Times New Roman" w:cs="Times New Roman"/>
+          <w:sz w:val="26"/>
+          <w:szCs w:val="26"/>
+        </w:rPr>
+        <w:drawing>
+          <wp:inline distT="0" distB="0" distL="0" distR="0" wp14:anchorId="6C33D62F" wp14:editId="0C4FC9DC">
+            <wp:extent cx="5943600" cy="4844415"/>
+            <wp:effectExtent l="0" t="0" r="0" b="0"/>
+            <wp:docPr id="1634992084" name="Picture 1"/>
+            <wp:cNvGraphicFramePr>
+              <a:graphicFrameLocks xmlns:a="http://schemas.openxmlformats.org/drawingml/2006/main" noChangeAspect="1"/>
+            </wp:cNvGraphicFramePr>
+            <a:graphic xmlns:a="http://schemas.openxmlformats.org/drawingml/2006/main">
+              <a:graphicData uri="http://schemas.openxmlformats.org/drawingml/2006/picture">
+                <pic:pic xmlns:pic="http://schemas.openxmlformats.org/drawingml/2006/picture">
+                  <pic:nvPicPr>
+                    <pic:cNvPr id="1634992084" name=""/>
+                    <pic:cNvPicPr/>
+                  </pic:nvPicPr>
+                  <pic:blipFill>
+                    <a:blip r:embed="rId10"/>
+                    <a:stretch>
+                      <a:fillRect/>
+                    </a:stretch>
+                  </pic:blipFill>
+                  <pic:spPr>
+                    <a:xfrm>
+                      <a:off x="0" y="0"/>
+                      <a:ext cx="5943600" cy="4844415"/>
+                    </a:xfrm>
+                    <a:prstGeom prst="rect">
+                      <a:avLst/>
+                    </a:prstGeom>
+                  </pic:spPr>
+                </pic:pic>
+              </a:graphicData>
+            </a:graphic>
+          </wp:inline>
+        </w:drawing>
+      </w:r>
     </w:p>
     <w:p>
       <w:pPr>
@@ -753,42 +1750,494 @@
         </w:numPr>
         <w:rPr>
           <w:rFonts w:ascii="Times New Roman" w:hAnsi="Times New Roman" w:cs="Times New Roman"/>
-          <w:sz w:val="28"/>
-          <w:szCs w:val="28"/>
-        </w:rPr>
-      </w:pPr>
-      <w:r>
-        <w:rPr>
-          <w:rFonts w:ascii="Times New Roman" w:hAnsi="Times New Roman" w:cs="Times New Roman"/>
-          <w:sz w:val="28"/>
-          <w:szCs w:val="28"/>
+          <w:sz w:val="26"/>
+          <w:szCs w:val="26"/>
+        </w:rPr>
+      </w:pPr>
+      <w:r>
+        <w:rPr>
+          <w:rFonts w:ascii="Times New Roman" w:hAnsi="Times New Roman" w:cs="Times New Roman"/>
+          <w:sz w:val="26"/>
+          <w:szCs w:val="26"/>
         </w:rPr>
         <w:t>Kết luận</w:t>
+      </w:r>
+    </w:p>
+    <w:tbl>
+      <w:tblPr>
+        <w:tblStyle w:val="TableGridLight"/>
+        <w:tblW w:w="0" w:type="auto"/>
+        <w:tblBorders>
+          <w:top w:val="single" w:sz="2" w:space="0" w:color="auto"/>
+          <w:left w:val="single" w:sz="2" w:space="0" w:color="auto"/>
+          <w:bottom w:val="single" w:sz="2" w:space="0" w:color="auto"/>
+          <w:right w:val="single" w:sz="2" w:space="0" w:color="auto"/>
+          <w:insideH w:val="single" w:sz="2" w:space="0" w:color="auto"/>
+          <w:insideV w:val="single" w:sz="2" w:space="0" w:color="auto"/>
+        </w:tblBorders>
+        <w:tblLook w:val="04A0" w:firstRow="1" w:lastRow="0" w:firstColumn="1" w:lastColumn="0" w:noHBand="0" w:noVBand="1"/>
+      </w:tblPr>
+      <w:tblGrid>
+        <w:gridCol w:w="1256"/>
+        <w:gridCol w:w="3530"/>
+        <w:gridCol w:w="3572"/>
+        <w:gridCol w:w="996"/>
+      </w:tblGrid>
+      <w:tr>
+        <w:tc>
+          <w:tcPr>
+            <w:tcW w:w="0" w:type="auto"/>
+            <w:hideMark/>
+          </w:tcPr>
+          <w:p>
+            <w:pPr>
+              <w:pStyle w:val="ListParagraph"/>
+              <w:ind w:left="0"/>
+              <w:rPr>
+                <w:rFonts w:ascii="Times New Roman" w:hAnsi="Times New Roman" w:cs="Times New Roman"/>
+                <w:sz w:val="26"/>
+                <w:szCs w:val="26"/>
+              </w:rPr>
+            </w:pPr>
+          </w:p>
+        </w:tc>
+        <w:tc>
+          <w:tcPr>
+            <w:tcW w:w="0" w:type="auto"/>
+            <w:hideMark/>
+          </w:tcPr>
+          <w:p>
+            <w:pPr>
+              <w:pStyle w:val="ListParagraph"/>
+              <w:ind w:left="0"/>
+              <w:rPr>
+                <w:rFonts w:ascii="Times New Roman" w:hAnsi="Times New Roman" w:cs="Times New Roman"/>
+                <w:sz w:val="26"/>
+                <w:szCs w:val="26"/>
+              </w:rPr>
+            </w:pPr>
+            <w:r>
+              <w:rPr>
+                <w:rFonts w:ascii="Times New Roman" w:hAnsi="Times New Roman" w:cs="Times New Roman"/>
+                <w:sz w:val="26"/>
+                <w:szCs w:val="26"/>
+              </w:rPr>
+              <w:t>Ưu điểm</w:t>
+            </w:r>
+          </w:p>
+        </w:tc>
+        <w:tc>
+          <w:tcPr>
+            <w:tcW w:w="0" w:type="auto"/>
+            <w:hideMark/>
+          </w:tcPr>
+          <w:p>
+            <w:pPr>
+              <w:pStyle w:val="ListParagraph"/>
+              <w:ind w:left="0"/>
+              <w:rPr>
+                <w:rFonts w:ascii="Times New Roman" w:hAnsi="Times New Roman" w:cs="Times New Roman"/>
+                <w:sz w:val="26"/>
+                <w:szCs w:val="26"/>
+              </w:rPr>
+            </w:pPr>
+            <w:r>
+              <w:rPr>
+                <w:rFonts w:ascii="Times New Roman" w:hAnsi="Times New Roman" w:cs="Times New Roman"/>
+                <w:sz w:val="26"/>
+                <w:szCs w:val="26"/>
+              </w:rPr>
+              <w:t>Nhược điểm</w:t>
+            </w:r>
+          </w:p>
+        </w:tc>
+        <w:tc>
+          <w:tcPr>
+            <w:tcW w:w="0" w:type="auto"/>
+            <w:hideMark/>
+          </w:tcPr>
+          <w:p>
+            <w:pPr>
+              <w:pStyle w:val="ListParagraph"/>
+              <w:ind w:left="0"/>
+              <w:rPr>
+                <w:rFonts w:ascii="Times New Roman" w:hAnsi="Times New Roman" w:cs="Times New Roman"/>
+                <w:sz w:val="26"/>
+                <w:szCs w:val="26"/>
+              </w:rPr>
+            </w:pPr>
+            <w:r>
+              <w:rPr>
+                <w:rFonts w:ascii="Times New Roman" w:hAnsi="Times New Roman" w:cs="Times New Roman"/>
+                <w:sz w:val="26"/>
+                <w:szCs w:val="26"/>
+              </w:rPr>
+              <w:t>Phù hợp</w:t>
+            </w:r>
+          </w:p>
+        </w:tc>
+      </w:tr>
+      <w:tr>
+        <w:tc>
+          <w:tcPr>
+            <w:tcW w:w="0" w:type="auto"/>
+            <w:hideMark/>
+          </w:tcPr>
+          <w:p>
+            <w:pPr>
+              <w:pStyle w:val="ListParagraph"/>
+              <w:ind w:left="0"/>
+              <w:rPr>
+                <w:rFonts w:ascii="Times New Roman" w:hAnsi="Times New Roman" w:cs="Times New Roman"/>
+                <w:sz w:val="26"/>
+                <w:szCs w:val="26"/>
+              </w:rPr>
+            </w:pPr>
+            <w:r>
+              <w:rPr>
+                <w:rFonts w:ascii="Times New Roman" w:hAnsi="Times New Roman" w:cs="Times New Roman"/>
+                <w:sz w:val="26"/>
+                <w:szCs w:val="26"/>
+              </w:rPr>
+              <w:t>State</w:t>
+            </w:r>
+          </w:p>
+        </w:tc>
+        <w:tc>
+          <w:tcPr>
+            <w:tcW w:w="0" w:type="auto"/>
+            <w:hideMark/>
+          </w:tcPr>
+          <w:p>
+            <w:pPr>
+              <w:pStyle w:val="ListParagraph"/>
+              <w:ind w:left="0"/>
+              <w:rPr>
+                <w:rFonts w:ascii="Times New Roman" w:hAnsi="Times New Roman" w:cs="Times New Roman"/>
+                <w:sz w:val="26"/>
+                <w:szCs w:val="26"/>
+              </w:rPr>
+            </w:pPr>
+            <w:r>
+              <w:rPr>
+                <w:rFonts w:ascii="Times New Roman" w:hAnsi="Times New Roman" w:cs="Times New Roman"/>
+                <w:sz w:val="26"/>
+                <w:szCs w:val="26"/>
+              </w:rPr>
+              <w:t>Quản lý trạng thái rõ ràng, logic tách biệt, dễ mở rộng</w:t>
+            </w:r>
+          </w:p>
+        </w:tc>
+        <w:tc>
+          <w:tcPr>
+            <w:tcW w:w="0" w:type="auto"/>
+            <w:hideMark/>
+          </w:tcPr>
+          <w:p>
+            <w:pPr>
+              <w:pStyle w:val="ListParagraph"/>
+              <w:ind w:left="0"/>
+              <w:rPr>
+                <w:rFonts w:ascii="Times New Roman" w:hAnsi="Times New Roman" w:cs="Times New Roman"/>
+                <w:sz w:val="26"/>
+                <w:szCs w:val="26"/>
+              </w:rPr>
+            </w:pPr>
+            <w:r>
+              <w:rPr>
+                <w:rFonts w:ascii="Times New Roman" w:hAnsi="Times New Roman" w:cs="Times New Roman"/>
+                <w:sz w:val="26"/>
+                <w:szCs w:val="26"/>
+              </w:rPr>
+              <w:t>Nhiều class, khó theo dõi nếu hệ thống lớn</w:t>
+            </w:r>
+          </w:p>
+        </w:tc>
+        <w:tc>
+          <w:tcPr>
+            <w:tcW w:w="0" w:type="auto"/>
+            <w:hideMark/>
+          </w:tcPr>
+          <w:p>
+            <w:pPr>
+              <w:pStyle w:val="ListParagraph"/>
+              <w:ind w:left="0"/>
+              <w:rPr>
+                <w:rFonts w:ascii="Times New Roman" w:hAnsi="Times New Roman" w:cs="Times New Roman"/>
+                <w:sz w:val="26"/>
+                <w:szCs w:val="26"/>
+              </w:rPr>
+            </w:pPr>
+            <w:r>
+              <w:rPr>
+                <w:rFonts w:ascii="Times New Roman" w:hAnsi="Times New Roman" w:cs="Times New Roman"/>
+                <w:sz w:val="26"/>
+                <w:szCs w:val="26"/>
+              </w:rPr>
+              <w:t>Không</w:t>
+            </w:r>
+          </w:p>
+        </w:tc>
+      </w:tr>
+      <w:tr>
+        <w:tc>
+          <w:tcPr>
+            <w:tcW w:w="0" w:type="auto"/>
+            <w:hideMark/>
+          </w:tcPr>
+          <w:p>
+            <w:pPr>
+              <w:pStyle w:val="ListParagraph"/>
+              <w:ind w:left="0"/>
+              <w:rPr>
+                <w:rFonts w:ascii="Times New Roman" w:hAnsi="Times New Roman" w:cs="Times New Roman"/>
+                <w:sz w:val="26"/>
+                <w:szCs w:val="26"/>
+              </w:rPr>
+            </w:pPr>
+            <w:r>
+              <w:rPr>
+                <w:rFonts w:ascii="Times New Roman" w:hAnsi="Times New Roman" w:cs="Times New Roman"/>
+                <w:sz w:val="26"/>
+                <w:szCs w:val="26"/>
+              </w:rPr>
+              <w:t>Strategy</w:t>
+            </w:r>
+          </w:p>
+        </w:tc>
+        <w:tc>
+          <w:tcPr>
+            <w:tcW w:w="0" w:type="auto"/>
+            <w:hideMark/>
+          </w:tcPr>
+          <w:p>
+            <w:pPr>
+              <w:pStyle w:val="ListParagraph"/>
+              <w:ind w:left="0"/>
+              <w:rPr>
+                <w:rFonts w:ascii="Times New Roman" w:hAnsi="Times New Roman" w:cs="Times New Roman"/>
+                <w:sz w:val="26"/>
+                <w:szCs w:val="26"/>
+              </w:rPr>
+            </w:pPr>
+            <w:r>
+              <w:rPr>
+                <w:rFonts w:ascii="Times New Roman" w:hAnsi="Times New Roman" w:cs="Times New Roman"/>
+                <w:sz w:val="26"/>
+                <w:szCs w:val="26"/>
+              </w:rPr>
+              <w:t>Thay đổi thuật toán linh hoạt, dễ tái sử dụng</w:t>
+            </w:r>
+          </w:p>
+        </w:tc>
+        <w:tc>
+          <w:tcPr>
+            <w:tcW w:w="0" w:type="auto"/>
+            <w:hideMark/>
+          </w:tcPr>
+          <w:p>
+            <w:pPr>
+              <w:pStyle w:val="ListParagraph"/>
+              <w:ind w:left="0"/>
+              <w:rPr>
+                <w:rFonts w:ascii="Times New Roman" w:hAnsi="Times New Roman" w:cs="Times New Roman"/>
+                <w:sz w:val="26"/>
+                <w:szCs w:val="26"/>
+              </w:rPr>
+            </w:pPr>
+            <w:r>
+              <w:rPr>
+                <w:rFonts w:ascii="Times New Roman" w:hAnsi="Times New Roman" w:cs="Times New Roman"/>
+                <w:sz w:val="26"/>
+                <w:szCs w:val="26"/>
+              </w:rPr>
+              <w:t>Không quản lý trạng thái, client phải chọn strategy</w:t>
+            </w:r>
+          </w:p>
+        </w:tc>
+        <w:tc>
+          <w:tcPr>
+            <w:tcW w:w="0" w:type="auto"/>
+            <w:hideMark/>
+          </w:tcPr>
+          <w:p>
+            <w:pPr>
+              <w:pStyle w:val="ListParagraph"/>
+              <w:ind w:left="0"/>
+              <w:rPr>
+                <w:rFonts w:ascii="Times New Roman" w:hAnsi="Times New Roman" w:cs="Times New Roman"/>
+                <w:sz w:val="26"/>
+                <w:szCs w:val="26"/>
+              </w:rPr>
+            </w:pPr>
+            <w:r>
+              <w:rPr>
+                <w:rFonts w:ascii="Times New Roman" w:hAnsi="Times New Roman" w:cs="Times New Roman"/>
+                <w:sz w:val="26"/>
+                <w:szCs w:val="26"/>
+              </w:rPr>
+              <w:t>Có</w:t>
+            </w:r>
+          </w:p>
+        </w:tc>
+      </w:tr>
+      <w:tr>
+        <w:tc>
+          <w:tcPr>
+            <w:tcW w:w="0" w:type="auto"/>
+            <w:hideMark/>
+          </w:tcPr>
+          <w:p>
+            <w:pPr>
+              <w:pStyle w:val="ListParagraph"/>
+              <w:ind w:left="0"/>
+              <w:rPr>
+                <w:rFonts w:ascii="Times New Roman" w:hAnsi="Times New Roman" w:cs="Times New Roman"/>
+                <w:sz w:val="26"/>
+                <w:szCs w:val="26"/>
+              </w:rPr>
+            </w:pPr>
+            <w:r>
+              <w:rPr>
+                <w:rFonts w:ascii="Times New Roman" w:hAnsi="Times New Roman" w:cs="Times New Roman"/>
+                <w:sz w:val="26"/>
+                <w:szCs w:val="26"/>
+              </w:rPr>
+              <w:t>Decorator</w:t>
+            </w:r>
+          </w:p>
+        </w:tc>
+        <w:tc>
+          <w:tcPr>
+            <w:tcW w:w="0" w:type="auto"/>
+            <w:hideMark/>
+          </w:tcPr>
+          <w:p>
+            <w:pPr>
+              <w:pStyle w:val="ListParagraph"/>
+              <w:ind w:left="0"/>
+              <w:rPr>
+                <w:rFonts w:ascii="Times New Roman" w:hAnsi="Times New Roman" w:cs="Times New Roman"/>
+                <w:sz w:val="26"/>
+                <w:szCs w:val="26"/>
+              </w:rPr>
+            </w:pPr>
+            <w:r>
+              <w:rPr>
+                <w:rFonts w:ascii="Times New Roman" w:hAnsi="Times New Roman" w:cs="Times New Roman"/>
+                <w:sz w:val="26"/>
+                <w:szCs w:val="26"/>
+              </w:rPr>
+              <w:t>Mở rộng linh hoạt, kết hợp nhiều loại thuế, không sửa code gốc</w:t>
+            </w:r>
+          </w:p>
+        </w:tc>
+        <w:tc>
+          <w:tcPr>
+            <w:tcW w:w="0" w:type="auto"/>
+            <w:hideMark/>
+          </w:tcPr>
+          <w:p>
+            <w:pPr>
+              <w:pStyle w:val="ListParagraph"/>
+              <w:ind w:left="0"/>
+              <w:rPr>
+                <w:rFonts w:ascii="Times New Roman" w:hAnsi="Times New Roman" w:cs="Times New Roman"/>
+                <w:sz w:val="26"/>
+                <w:szCs w:val="26"/>
+              </w:rPr>
+            </w:pPr>
+            <w:r>
+              <w:rPr>
+                <w:rFonts w:ascii="Times New Roman" w:hAnsi="Times New Roman" w:cs="Times New Roman"/>
+                <w:sz w:val="26"/>
+                <w:szCs w:val="26"/>
+              </w:rPr>
+              <w:t>Nhiều lớp wrapper, có thể phức tạp khi lồng nhiều decorator</w:t>
+            </w:r>
+          </w:p>
+        </w:tc>
+        <w:tc>
+          <w:tcPr>
+            <w:tcW w:w="0" w:type="auto"/>
+            <w:hideMark/>
+          </w:tcPr>
+          <w:p>
+            <w:pPr>
+              <w:pStyle w:val="ListParagraph"/>
+              <w:ind w:left="0"/>
+              <w:rPr>
+                <w:rFonts w:ascii="Times New Roman" w:hAnsi="Times New Roman" w:cs="Times New Roman"/>
+                <w:sz w:val="26"/>
+                <w:szCs w:val="26"/>
+              </w:rPr>
+            </w:pPr>
+            <w:r>
+              <w:rPr>
+                <w:rFonts w:ascii="Times New Roman" w:hAnsi="Times New Roman" w:cs="Times New Roman"/>
+                <w:sz w:val="26"/>
+                <w:szCs w:val="26"/>
+              </w:rPr>
+              <w:t>Có</w:t>
+            </w:r>
+          </w:p>
+        </w:tc>
+      </w:tr>
+    </w:tbl>
+    <w:p>
+      <w:pPr>
+        <w:pStyle w:val="ListParagraph"/>
+        <w:ind w:left="360"/>
+        <w:rPr>
+          <w:rFonts w:ascii="Times New Roman" w:hAnsi="Times New Roman" w:cs="Times New Roman"/>
+          <w:sz w:val="26"/>
+          <w:szCs w:val="26"/>
+        </w:rPr>
+      </w:pPr>
+      <w:r>
+        <w:rPr>
+          <w:rFonts w:ascii="Times New Roman" w:hAnsi="Times New Roman" w:cs="Times New Roman"/>
+          <w:sz w:val="26"/>
+          <w:szCs w:val="26"/>
+        </w:rPr>
+        <w:t xml:space="preserve"> </w:t>
+      </w:r>
+      <w:r>
+        <w:rPr>
+          <w:rFonts w:ascii="Times New Roman" w:hAnsi="Times New Roman" w:cs="Times New Roman"/>
+          <w:sz w:val="26"/>
+          <w:szCs w:val="26"/>
+        </w:rPr>
+        <w:tab/>
       </w:r>
     </w:p>
     <w:p>
       <w:pPr>
-        <w:pStyle w:val="ListParagraph"/>
-        <w:ind w:left="360"/>
-        <w:rPr>
-          <w:rFonts w:ascii="Times New Roman" w:hAnsi="Times New Roman" w:cs="Times New Roman"/>
-          <w:sz w:val="28"/>
-          <w:szCs w:val="28"/>
-        </w:rPr>
-      </w:pPr>
-      <w:r>
-        <w:rPr>
-          <w:rFonts w:ascii="Times New Roman" w:hAnsi="Times New Roman" w:cs="Times New Roman"/>
-          <w:sz w:val="28"/>
-          <w:szCs w:val="28"/>
-        </w:rPr>
-        <w:t xml:space="preserve"> </w:t>
-      </w:r>
-      <w:r>
-        <w:rPr>
-          <w:rFonts w:ascii="Times New Roman" w:hAnsi="Times New Roman" w:cs="Times New Roman"/>
-          <w:sz w:val="28"/>
-          <w:szCs w:val="28"/>
+        <w:rPr>
+          <w:rFonts w:ascii="Times New Roman" w:hAnsi="Times New Roman" w:cs="Times New Roman"/>
+          <w:b/>
+          <w:bCs/>
+          <w:sz w:val="26"/>
+          <w:szCs w:val="26"/>
+        </w:rPr>
+      </w:pPr>
+      <w:r>
+        <w:rPr>
+          <w:rFonts w:ascii="Times New Roman" w:hAnsi="Times New Roman" w:cs="Times New Roman"/>
+          <w:b/>
+          <w:bCs/>
+          <w:sz w:val="26"/>
+          <w:szCs w:val="26"/>
+        </w:rPr>
+        <w:t>3. Tạo một hệ thống thanh toán, nơi bạn có thể thanh toán bằng các phương thức khác nhau như Thẻ tín dụng, PayPal, và có thể thêm các phương thức thanh toán này với các tính năng bổ sung như Phí xử lý, Mã giảm giá.</w:t>
+      </w:r>
+      <w:r>
+        <w:rPr>
+          <w:rFonts w:ascii="Times New Roman" w:hAnsi="Times New Roman" w:cs="Times New Roman"/>
+          <w:b/>
+          <w:bCs/>
+          <w:sz w:val="26"/>
+          <w:szCs w:val="26"/>
         </w:rPr>
         <w:tab/>
       </w:r>
@@ -797,48 +2246,19 @@
       <w:pPr>
         <w:rPr>
           <w:rFonts w:ascii="Times New Roman" w:hAnsi="Times New Roman" w:cs="Times New Roman"/>
-          <w:sz w:val="28"/>
-          <w:szCs w:val="28"/>
-        </w:rPr>
-      </w:pPr>
-      <w:r>
-        <w:rPr>
-          <w:rFonts w:ascii="Times New Roman" w:hAnsi="Times New Roman" w:cs="Times New Roman"/>
-          <w:sz w:val="28"/>
-          <w:szCs w:val="28"/>
-        </w:rPr>
-        <w:t xml:space="preserve">3. </w:t>
-      </w:r>
-      <w:r>
-        <w:rPr>
-          <w:rFonts w:ascii="Times New Roman" w:hAnsi="Times New Roman" w:cs="Times New Roman"/>
-          <w:sz w:val="28"/>
-          <w:szCs w:val="28"/>
-        </w:rPr>
-        <w:t>Tạo một hệ thống thanh toán, nơi bạn có thể thanh toán bằng các phương thức khác nhau như Thẻ tín dụng, PayPal, và có thể thêm các phương thức thanh toán này với các tính năng bổ sung như Phí xử lý, Mã giảm giá.</w:t>
-      </w:r>
-      <w:r>
-        <w:rPr>
-          <w:rFonts w:ascii="Times New Roman" w:hAnsi="Times New Roman" w:cs="Times New Roman"/>
-          <w:sz w:val="28"/>
-          <w:szCs w:val="28"/>
-        </w:rPr>
-        <w:tab/>
-      </w:r>
-    </w:p>
-    <w:p>
-      <w:pPr>
-        <w:rPr>
-          <w:rFonts w:ascii="Times New Roman" w:hAnsi="Times New Roman" w:cs="Times New Roman"/>
-          <w:sz w:val="28"/>
-          <w:szCs w:val="28"/>
-        </w:rPr>
-      </w:pPr>
-      <w:r>
-        <w:rPr>
-          <w:rFonts w:ascii="Times New Roman" w:hAnsi="Times New Roman" w:cs="Times New Roman"/>
-          <w:sz w:val="28"/>
-          <w:szCs w:val="28"/>
+          <w:b/>
+          <w:bCs/>
+          <w:sz w:val="26"/>
+          <w:szCs w:val="26"/>
+        </w:rPr>
+      </w:pPr>
+      <w:r>
+        <w:rPr>
+          <w:rFonts w:ascii="Times New Roman" w:hAnsi="Times New Roman" w:cs="Times New Roman"/>
+          <w:b/>
+          <w:bCs/>
+          <w:sz w:val="26"/>
+          <w:szCs w:val="26"/>
         </w:rPr>
         <w:tab/>
         <w:t>Hãy dùng các Design Pattern: State, Strategy, Decorator viết bằng Java để xử lý mô phỏng trường hợp trên và đưa ra kết luận.</w:t>
@@ -846,8 +2266,10 @@
       <w:r>
         <w:rPr>
           <w:rFonts w:ascii="Times New Roman" w:hAnsi="Times New Roman" w:cs="Times New Roman"/>
-          <w:sz w:val="28"/>
-          <w:szCs w:val="28"/>
+          <w:b/>
+          <w:bCs/>
+          <w:sz w:val="26"/>
+          <w:szCs w:val="26"/>
         </w:rPr>
         <w:tab/>
       </w:r>
@@ -861,15 +2283,15 @@
         </w:numPr>
         <w:rPr>
           <w:rFonts w:ascii="Times New Roman" w:hAnsi="Times New Roman" w:cs="Times New Roman"/>
-          <w:sz w:val="28"/>
-          <w:szCs w:val="28"/>
-        </w:rPr>
-      </w:pPr>
-      <w:r>
-        <w:rPr>
-          <w:rFonts w:ascii="Times New Roman" w:hAnsi="Times New Roman" w:cs="Times New Roman"/>
-          <w:sz w:val="28"/>
-          <w:szCs w:val="28"/>
+          <w:sz w:val="26"/>
+          <w:szCs w:val="26"/>
+        </w:rPr>
+      </w:pPr>
+      <w:r>
+        <w:rPr>
+          <w:rFonts w:ascii="Times New Roman" w:hAnsi="Times New Roman" w:cs="Times New Roman"/>
+          <w:sz w:val="26"/>
+          <w:szCs w:val="26"/>
         </w:rPr>
         <w:t>Diagram State pattern</w:t>
       </w:r>
@@ -878,10 +2300,52 @@
       <w:pPr>
         <w:rPr>
           <w:rFonts w:ascii="Times New Roman" w:hAnsi="Times New Roman" w:cs="Times New Roman"/>
-          <w:sz w:val="28"/>
-          <w:szCs w:val="28"/>
-        </w:rPr>
-      </w:pPr>
+          <w:sz w:val="26"/>
+          <w:szCs w:val="26"/>
+        </w:rPr>
+      </w:pPr>
+      <w:r>
+        <w:rPr>
+          <w:rFonts w:ascii="Times New Roman" w:hAnsi="Times New Roman" w:cs="Times New Roman"/>
+          <w:sz w:val="26"/>
+          <w:szCs w:val="26"/>
+        </w:rPr>
+        <w:drawing>
+          <wp:inline distT="0" distB="0" distL="0" distR="0" wp14:anchorId="6AD948FE" wp14:editId="5165F5F5">
+            <wp:extent cx="5943600" cy="3221990"/>
+            <wp:effectExtent l="0" t="0" r="0" b="0"/>
+            <wp:docPr id="837537450" name="Picture 1"/>
+            <wp:cNvGraphicFramePr>
+              <a:graphicFrameLocks xmlns:a="http://schemas.openxmlformats.org/drawingml/2006/main" noChangeAspect="1"/>
+            </wp:cNvGraphicFramePr>
+            <a:graphic xmlns:a="http://schemas.openxmlformats.org/drawingml/2006/main">
+              <a:graphicData uri="http://schemas.openxmlformats.org/drawingml/2006/picture">
+                <pic:pic xmlns:pic="http://schemas.openxmlformats.org/drawingml/2006/picture">
+                  <pic:nvPicPr>
+                    <pic:cNvPr id="837537450" name=""/>
+                    <pic:cNvPicPr/>
+                  </pic:nvPicPr>
+                  <pic:blipFill>
+                    <a:blip r:embed="rId11"/>
+                    <a:stretch>
+                      <a:fillRect/>
+                    </a:stretch>
+                  </pic:blipFill>
+                  <pic:spPr>
+                    <a:xfrm>
+                      <a:off x="0" y="0"/>
+                      <a:ext cx="5943600" cy="3221990"/>
+                    </a:xfrm>
+                    <a:prstGeom prst="rect">
+                      <a:avLst/>
+                    </a:prstGeom>
+                  </pic:spPr>
+                </pic:pic>
+              </a:graphicData>
+            </a:graphic>
+          </wp:inline>
+        </w:drawing>
+      </w:r>
     </w:p>
     <w:p>
       <w:pPr>
@@ -892,15 +2356,15 @@
         </w:numPr>
         <w:rPr>
           <w:rFonts w:ascii="Times New Roman" w:hAnsi="Times New Roman" w:cs="Times New Roman"/>
-          <w:sz w:val="28"/>
-          <w:szCs w:val="28"/>
-        </w:rPr>
-      </w:pPr>
-      <w:r>
-        <w:rPr>
-          <w:rFonts w:ascii="Times New Roman" w:hAnsi="Times New Roman" w:cs="Times New Roman"/>
-          <w:sz w:val="28"/>
-          <w:szCs w:val="28"/>
+          <w:sz w:val="26"/>
+          <w:szCs w:val="26"/>
+        </w:rPr>
+      </w:pPr>
+      <w:r>
+        <w:rPr>
+          <w:rFonts w:ascii="Times New Roman" w:hAnsi="Times New Roman" w:cs="Times New Roman"/>
+          <w:sz w:val="26"/>
+          <w:szCs w:val="26"/>
         </w:rPr>
         <w:t>Diagram Strategy pattern</w:t>
       </w:r>
@@ -910,10 +2374,52 @@
         <w:pStyle w:val="ListParagraph"/>
         <w:rPr>
           <w:rFonts w:ascii="Times New Roman" w:hAnsi="Times New Roman" w:cs="Times New Roman"/>
-          <w:sz w:val="28"/>
-          <w:szCs w:val="28"/>
-        </w:rPr>
-      </w:pPr>
+          <w:sz w:val="26"/>
+          <w:szCs w:val="26"/>
+        </w:rPr>
+      </w:pPr>
+      <w:r>
+        <w:rPr>
+          <w:rFonts w:ascii="Times New Roman" w:hAnsi="Times New Roman" w:cs="Times New Roman"/>
+          <w:sz w:val="26"/>
+          <w:szCs w:val="26"/>
+        </w:rPr>
+        <w:drawing>
+          <wp:inline distT="0" distB="0" distL="0" distR="0" wp14:anchorId="0618819D" wp14:editId="18B200D6">
+            <wp:extent cx="5943600" cy="4587240"/>
+            <wp:effectExtent l="0" t="0" r="0" b="3810"/>
+            <wp:docPr id="1793385150" name="Picture 1"/>
+            <wp:cNvGraphicFramePr>
+              <a:graphicFrameLocks xmlns:a="http://schemas.openxmlformats.org/drawingml/2006/main" noChangeAspect="1"/>
+            </wp:cNvGraphicFramePr>
+            <a:graphic xmlns:a="http://schemas.openxmlformats.org/drawingml/2006/main">
+              <a:graphicData uri="http://schemas.openxmlformats.org/drawingml/2006/picture">
+                <pic:pic xmlns:pic="http://schemas.openxmlformats.org/drawingml/2006/picture">
+                  <pic:nvPicPr>
+                    <pic:cNvPr id="1793385150" name=""/>
+                    <pic:cNvPicPr/>
+                  </pic:nvPicPr>
+                  <pic:blipFill>
+                    <a:blip r:embed="rId12"/>
+                    <a:stretch>
+                      <a:fillRect/>
+                    </a:stretch>
+                  </pic:blipFill>
+                  <pic:spPr>
+                    <a:xfrm>
+                      <a:off x="0" y="0"/>
+                      <a:ext cx="5943600" cy="4587240"/>
+                    </a:xfrm>
+                    <a:prstGeom prst="rect">
+                      <a:avLst/>
+                    </a:prstGeom>
+                  </pic:spPr>
+                </pic:pic>
+              </a:graphicData>
+            </a:graphic>
+          </wp:inline>
+        </w:drawing>
+      </w:r>
     </w:p>
     <w:p>
       <w:pPr>
@@ -921,8 +2427,8 @@
         <w:ind w:left="1080"/>
         <w:rPr>
           <w:rFonts w:ascii="Times New Roman" w:hAnsi="Times New Roman" w:cs="Times New Roman"/>
-          <w:sz w:val="28"/>
-          <w:szCs w:val="28"/>
+          <w:sz w:val="26"/>
+          <w:szCs w:val="26"/>
         </w:rPr>
       </w:pPr>
     </w:p>
@@ -935,17 +2441,16 @@
         </w:numPr>
         <w:rPr>
           <w:rFonts w:ascii="Times New Roman" w:hAnsi="Times New Roman" w:cs="Times New Roman"/>
-          <w:sz w:val="28"/>
-          <w:szCs w:val="28"/>
-        </w:rPr>
-      </w:pPr>
-      <w:r>
-        <w:rPr>
-          <w:rFonts w:ascii="Times New Roman" w:hAnsi="Times New Roman" w:cs="Times New Roman"/>
-          <w:sz w:val="28"/>
-          <w:szCs w:val="28"/>
-        </w:rPr>
-        <w:lastRenderedPageBreak/>
+          <w:sz w:val="26"/>
+          <w:szCs w:val="26"/>
+        </w:rPr>
+      </w:pPr>
+      <w:r>
+        <w:rPr>
+          <w:rFonts w:ascii="Times New Roman" w:hAnsi="Times New Roman" w:cs="Times New Roman"/>
+          <w:sz w:val="26"/>
+          <w:szCs w:val="26"/>
+        </w:rPr>
         <w:t>Diagram Decorator pattern</w:t>
       </w:r>
     </w:p>
@@ -955,10 +2460,52 @@
         <w:ind w:left="1080"/>
         <w:rPr>
           <w:rFonts w:ascii="Times New Roman" w:hAnsi="Times New Roman" w:cs="Times New Roman"/>
-          <w:sz w:val="28"/>
-          <w:szCs w:val="28"/>
-        </w:rPr>
-      </w:pPr>
+          <w:sz w:val="26"/>
+          <w:szCs w:val="26"/>
+        </w:rPr>
+      </w:pPr>
+      <w:r>
+        <w:rPr>
+          <w:rFonts w:ascii="Times New Roman" w:hAnsi="Times New Roman" w:cs="Times New Roman"/>
+          <w:sz w:val="26"/>
+          <w:szCs w:val="26"/>
+        </w:rPr>
+        <w:drawing>
+          <wp:inline distT="0" distB="0" distL="0" distR="0" wp14:anchorId="226A631A" wp14:editId="743EA6B1">
+            <wp:extent cx="5943600" cy="3916680"/>
+            <wp:effectExtent l="0" t="0" r="0" b="7620"/>
+            <wp:docPr id="197344880" name="Picture 1"/>
+            <wp:cNvGraphicFramePr>
+              <a:graphicFrameLocks xmlns:a="http://schemas.openxmlformats.org/drawingml/2006/main" noChangeAspect="1"/>
+            </wp:cNvGraphicFramePr>
+            <a:graphic xmlns:a="http://schemas.openxmlformats.org/drawingml/2006/main">
+              <a:graphicData uri="http://schemas.openxmlformats.org/drawingml/2006/picture">
+                <pic:pic xmlns:pic="http://schemas.openxmlformats.org/drawingml/2006/picture">
+                  <pic:nvPicPr>
+                    <pic:cNvPr id="197344880" name=""/>
+                    <pic:cNvPicPr/>
+                  </pic:nvPicPr>
+                  <pic:blipFill>
+                    <a:blip r:embed="rId13"/>
+                    <a:stretch>
+                      <a:fillRect/>
+                    </a:stretch>
+                  </pic:blipFill>
+                  <pic:spPr>
+                    <a:xfrm>
+                      <a:off x="0" y="0"/>
+                      <a:ext cx="5943600" cy="3916680"/>
+                    </a:xfrm>
+                    <a:prstGeom prst="rect">
+                      <a:avLst/>
+                    </a:prstGeom>
+                  </pic:spPr>
+                </pic:pic>
+              </a:graphicData>
+            </a:graphic>
+          </wp:inline>
+        </w:drawing>
+      </w:r>
     </w:p>
     <w:p>
       <w:pPr>
@@ -969,25 +2516,446 @@
         </w:numPr>
         <w:rPr>
           <w:rFonts w:ascii="Times New Roman" w:hAnsi="Times New Roman" w:cs="Times New Roman"/>
-          <w:sz w:val="28"/>
-          <w:szCs w:val="28"/>
-        </w:rPr>
-      </w:pPr>
-      <w:r>
-        <w:rPr>
-          <w:rFonts w:ascii="Times New Roman" w:hAnsi="Times New Roman" w:cs="Times New Roman"/>
-          <w:sz w:val="28"/>
-          <w:szCs w:val="28"/>
+          <w:sz w:val="26"/>
+          <w:szCs w:val="26"/>
+        </w:rPr>
+      </w:pPr>
+      <w:r>
+        <w:rPr>
+          <w:rFonts w:ascii="Times New Roman" w:hAnsi="Times New Roman" w:cs="Times New Roman"/>
+          <w:sz w:val="26"/>
+          <w:szCs w:val="26"/>
         </w:rPr>
         <w:t>Kết luận</w:t>
       </w:r>
     </w:p>
+    <w:tbl>
+      <w:tblPr>
+        <w:tblStyle w:val="TableGridLight"/>
+        <w:tblW w:w="0" w:type="auto"/>
+        <w:tblBorders>
+          <w:top w:val="single" w:sz="2" w:space="0" w:color="auto"/>
+          <w:left w:val="single" w:sz="2" w:space="0" w:color="auto"/>
+          <w:bottom w:val="single" w:sz="2" w:space="0" w:color="auto"/>
+          <w:right w:val="single" w:sz="2" w:space="0" w:color="auto"/>
+          <w:insideH w:val="single" w:sz="2" w:space="0" w:color="auto"/>
+          <w:insideV w:val="single" w:sz="2" w:space="0" w:color="auto"/>
+        </w:tblBorders>
+        <w:tblLook w:val="04A0" w:firstRow="1" w:lastRow="0" w:firstColumn="1" w:lastColumn="0" w:noHBand="0" w:noVBand="1"/>
+      </w:tblPr>
+      <w:tblGrid>
+        <w:gridCol w:w="1256"/>
+        <w:gridCol w:w="3700"/>
+        <w:gridCol w:w="3369"/>
+        <w:gridCol w:w="1029"/>
+      </w:tblGrid>
+      <w:tr>
+        <w:tc>
+          <w:tcPr>
+            <w:tcW w:w="0" w:type="auto"/>
+            <w:hideMark/>
+          </w:tcPr>
+          <w:p>
+            <w:pPr>
+              <w:pStyle w:val="ListParagraph"/>
+              <w:ind w:left="0"/>
+              <w:rPr>
+                <w:rFonts w:ascii="Times New Roman" w:hAnsi="Times New Roman" w:cs="Times New Roman"/>
+                <w:sz w:val="26"/>
+                <w:szCs w:val="26"/>
+              </w:rPr>
+            </w:pPr>
+          </w:p>
+        </w:tc>
+        <w:tc>
+          <w:tcPr>
+            <w:tcW w:w="0" w:type="auto"/>
+            <w:hideMark/>
+          </w:tcPr>
+          <w:p>
+            <w:pPr>
+              <w:pStyle w:val="ListParagraph"/>
+              <w:ind w:left="0"/>
+              <w:rPr>
+                <w:rFonts w:ascii="Times New Roman" w:hAnsi="Times New Roman" w:cs="Times New Roman"/>
+                <w:sz w:val="26"/>
+                <w:szCs w:val="26"/>
+              </w:rPr>
+            </w:pPr>
+            <w:r>
+              <w:rPr>
+                <w:rFonts w:ascii="Times New Roman" w:hAnsi="Times New Roman" w:cs="Times New Roman"/>
+                <w:sz w:val="26"/>
+                <w:szCs w:val="26"/>
+              </w:rPr>
+              <w:t>Ưu điểm</w:t>
+            </w:r>
+          </w:p>
+        </w:tc>
+        <w:tc>
+          <w:tcPr>
+            <w:tcW w:w="0" w:type="auto"/>
+            <w:hideMark/>
+          </w:tcPr>
+          <w:p>
+            <w:pPr>
+              <w:pStyle w:val="ListParagraph"/>
+              <w:ind w:left="0"/>
+              <w:rPr>
+                <w:rFonts w:ascii="Times New Roman" w:hAnsi="Times New Roman" w:cs="Times New Roman"/>
+                <w:sz w:val="26"/>
+                <w:szCs w:val="26"/>
+              </w:rPr>
+            </w:pPr>
+            <w:r>
+              <w:rPr>
+                <w:rFonts w:ascii="Times New Roman" w:hAnsi="Times New Roman" w:cs="Times New Roman"/>
+                <w:sz w:val="26"/>
+                <w:szCs w:val="26"/>
+              </w:rPr>
+              <w:t>Nhược điểm</w:t>
+            </w:r>
+          </w:p>
+        </w:tc>
+        <w:tc>
+          <w:tcPr>
+            <w:tcW w:w="0" w:type="auto"/>
+            <w:hideMark/>
+          </w:tcPr>
+          <w:p>
+            <w:pPr>
+              <w:pStyle w:val="ListParagraph"/>
+              <w:ind w:left="0"/>
+              <w:rPr>
+                <w:rFonts w:ascii="Times New Roman" w:hAnsi="Times New Roman" w:cs="Times New Roman"/>
+                <w:sz w:val="26"/>
+                <w:szCs w:val="26"/>
+              </w:rPr>
+            </w:pPr>
+            <w:r>
+              <w:rPr>
+                <w:rFonts w:ascii="Times New Roman" w:hAnsi="Times New Roman" w:cs="Times New Roman"/>
+                <w:sz w:val="26"/>
+                <w:szCs w:val="26"/>
+              </w:rPr>
+              <w:t>Phù hợp</w:t>
+            </w:r>
+          </w:p>
+        </w:tc>
+      </w:tr>
+      <w:tr>
+        <w:tc>
+          <w:tcPr>
+            <w:tcW w:w="0" w:type="auto"/>
+            <w:hideMark/>
+          </w:tcPr>
+          <w:p>
+            <w:pPr>
+              <w:pStyle w:val="ListParagraph"/>
+              <w:ind w:left="0"/>
+              <w:rPr>
+                <w:rFonts w:ascii="Times New Roman" w:hAnsi="Times New Roman" w:cs="Times New Roman"/>
+                <w:sz w:val="26"/>
+                <w:szCs w:val="26"/>
+              </w:rPr>
+            </w:pPr>
+            <w:r>
+              <w:rPr>
+                <w:rFonts w:ascii="Times New Roman" w:hAnsi="Times New Roman" w:cs="Times New Roman"/>
+                <w:sz w:val="26"/>
+                <w:szCs w:val="26"/>
+              </w:rPr>
+              <w:t>State</w:t>
+            </w:r>
+          </w:p>
+        </w:tc>
+        <w:tc>
+          <w:tcPr>
+            <w:tcW w:w="0" w:type="auto"/>
+            <w:hideMark/>
+          </w:tcPr>
+          <w:p>
+            <w:pPr>
+              <w:pStyle w:val="ListParagraph"/>
+              <w:ind w:left="0"/>
+              <w:rPr>
+                <w:rFonts w:ascii="Times New Roman" w:hAnsi="Times New Roman" w:cs="Times New Roman"/>
+                <w:sz w:val="26"/>
+                <w:szCs w:val="26"/>
+              </w:rPr>
+            </w:pPr>
+            <w:r>
+              <w:rPr>
+                <w:rFonts w:ascii="Times New Roman" w:hAnsi="Times New Roman" w:cs="Times New Roman"/>
+                <w:sz w:val="26"/>
+                <w:szCs w:val="26"/>
+              </w:rPr>
+              <w:t>Quản lý trạng thái thanh toán rõ ràng</w:t>
+            </w:r>
+          </w:p>
+        </w:tc>
+        <w:tc>
+          <w:tcPr>
+            <w:tcW w:w="0" w:type="auto"/>
+            <w:hideMark/>
+          </w:tcPr>
+          <w:p>
+            <w:pPr>
+              <w:pStyle w:val="ListParagraph"/>
+              <w:ind w:left="0"/>
+              <w:rPr>
+                <w:rFonts w:ascii="Times New Roman" w:hAnsi="Times New Roman" w:cs="Times New Roman"/>
+                <w:sz w:val="26"/>
+                <w:szCs w:val="26"/>
+              </w:rPr>
+            </w:pPr>
+            <w:r>
+              <w:rPr>
+                <w:rFonts w:ascii="Times New Roman" w:hAnsi="Times New Roman" w:cs="Times New Roman"/>
+                <w:sz w:val="26"/>
+                <w:szCs w:val="26"/>
+              </w:rPr>
+              <w:t>Nhiều class</w:t>
+            </w:r>
+          </w:p>
+        </w:tc>
+        <w:tc>
+          <w:tcPr>
+            <w:tcW w:w="0" w:type="auto"/>
+            <w:hideMark/>
+          </w:tcPr>
+          <w:p>
+            <w:pPr>
+              <w:pStyle w:val="ListParagraph"/>
+              <w:ind w:left="0"/>
+              <w:rPr>
+                <w:rFonts w:ascii="Times New Roman" w:hAnsi="Times New Roman" w:cs="Times New Roman"/>
+                <w:sz w:val="26"/>
+                <w:szCs w:val="26"/>
+              </w:rPr>
+            </w:pPr>
+            <w:r>
+              <w:rPr>
+                <w:rFonts w:ascii="Times New Roman" w:hAnsi="Times New Roman" w:cs="Times New Roman"/>
+                <w:sz w:val="26"/>
+                <w:szCs w:val="26"/>
+              </w:rPr>
+              <w:t>Có</w:t>
+            </w:r>
+          </w:p>
+        </w:tc>
+      </w:tr>
+      <w:tr>
+        <w:tc>
+          <w:tcPr>
+            <w:tcW w:w="0" w:type="auto"/>
+            <w:hideMark/>
+          </w:tcPr>
+          <w:p>
+            <w:pPr>
+              <w:pStyle w:val="ListParagraph"/>
+              <w:ind w:left="0"/>
+              <w:rPr>
+                <w:rFonts w:ascii="Times New Roman" w:hAnsi="Times New Roman" w:cs="Times New Roman"/>
+                <w:sz w:val="26"/>
+                <w:szCs w:val="26"/>
+              </w:rPr>
+            </w:pPr>
+            <w:r>
+              <w:rPr>
+                <w:rFonts w:ascii="Times New Roman" w:hAnsi="Times New Roman" w:cs="Times New Roman"/>
+                <w:sz w:val="26"/>
+                <w:szCs w:val="26"/>
+              </w:rPr>
+              <w:t>Strategy</w:t>
+            </w:r>
+          </w:p>
+        </w:tc>
+        <w:tc>
+          <w:tcPr>
+            <w:tcW w:w="0" w:type="auto"/>
+            <w:hideMark/>
+          </w:tcPr>
+          <w:p>
+            <w:pPr>
+              <w:pStyle w:val="ListParagraph"/>
+              <w:ind w:left="0"/>
+              <w:rPr>
+                <w:rFonts w:ascii="Times New Roman" w:hAnsi="Times New Roman" w:cs="Times New Roman"/>
+                <w:sz w:val="26"/>
+                <w:szCs w:val="26"/>
+              </w:rPr>
+            </w:pPr>
+            <w:r>
+              <w:rPr>
+                <w:rFonts w:ascii="Times New Roman" w:hAnsi="Times New Roman" w:cs="Times New Roman"/>
+                <w:sz w:val="26"/>
+                <w:szCs w:val="26"/>
+              </w:rPr>
+              <w:t>Dễ thay đổi phương thức thanh toán</w:t>
+            </w:r>
+          </w:p>
+        </w:tc>
+        <w:tc>
+          <w:tcPr>
+            <w:tcW w:w="0" w:type="auto"/>
+            <w:hideMark/>
+          </w:tcPr>
+          <w:p>
+            <w:pPr>
+              <w:pStyle w:val="ListParagraph"/>
+              <w:ind w:left="0"/>
+              <w:rPr>
+                <w:rFonts w:ascii="Times New Roman" w:hAnsi="Times New Roman" w:cs="Times New Roman"/>
+                <w:sz w:val="26"/>
+                <w:szCs w:val="26"/>
+              </w:rPr>
+            </w:pPr>
+            <w:r>
+              <w:rPr>
+                <w:rFonts w:ascii="Times New Roman" w:hAnsi="Times New Roman" w:cs="Times New Roman"/>
+                <w:sz w:val="26"/>
+                <w:szCs w:val="26"/>
+              </w:rPr>
+              <w:t>Không quản lý trạng thái</w:t>
+            </w:r>
+          </w:p>
+        </w:tc>
+        <w:tc>
+          <w:tcPr>
+            <w:tcW w:w="0" w:type="auto"/>
+            <w:hideMark/>
+          </w:tcPr>
+          <w:p>
+            <w:pPr>
+              <w:pStyle w:val="ListParagraph"/>
+              <w:ind w:left="0"/>
+              <w:rPr>
+                <w:rFonts w:ascii="Times New Roman" w:hAnsi="Times New Roman" w:cs="Times New Roman"/>
+                <w:sz w:val="26"/>
+                <w:szCs w:val="26"/>
+              </w:rPr>
+            </w:pPr>
+            <w:r>
+              <w:rPr>
+                <w:rFonts w:ascii="Times New Roman" w:hAnsi="Times New Roman" w:cs="Times New Roman"/>
+                <w:sz w:val="26"/>
+                <w:szCs w:val="26"/>
+              </w:rPr>
+              <w:t>Có</w:t>
+            </w:r>
+          </w:p>
+        </w:tc>
+      </w:tr>
+      <w:tr>
+        <w:tc>
+          <w:tcPr>
+            <w:tcW w:w="0" w:type="auto"/>
+            <w:hideMark/>
+          </w:tcPr>
+          <w:p>
+            <w:pPr>
+              <w:pStyle w:val="ListParagraph"/>
+              <w:ind w:left="0"/>
+              <w:rPr>
+                <w:rFonts w:ascii="Times New Roman" w:hAnsi="Times New Roman" w:cs="Times New Roman"/>
+                <w:sz w:val="26"/>
+                <w:szCs w:val="26"/>
+              </w:rPr>
+            </w:pPr>
+            <w:r>
+              <w:rPr>
+                <w:rFonts w:ascii="Times New Roman" w:hAnsi="Times New Roman" w:cs="Times New Roman"/>
+                <w:sz w:val="26"/>
+                <w:szCs w:val="26"/>
+              </w:rPr>
+              <w:t>Decorator</w:t>
+            </w:r>
+          </w:p>
+        </w:tc>
+        <w:tc>
+          <w:tcPr>
+            <w:tcW w:w="0" w:type="auto"/>
+            <w:hideMark/>
+          </w:tcPr>
+          <w:p>
+            <w:pPr>
+              <w:pStyle w:val="ListParagraph"/>
+              <w:ind w:left="0"/>
+              <w:rPr>
+                <w:rFonts w:ascii="Times New Roman" w:hAnsi="Times New Roman" w:cs="Times New Roman"/>
+                <w:sz w:val="26"/>
+                <w:szCs w:val="26"/>
+              </w:rPr>
+            </w:pPr>
+            <w:r>
+              <w:rPr>
+                <w:rFonts w:ascii="Times New Roman" w:hAnsi="Times New Roman" w:cs="Times New Roman"/>
+                <w:sz w:val="26"/>
+                <w:szCs w:val="26"/>
+              </w:rPr>
+              <w:t>Thêm phí, giảm giá linh hoạt</w:t>
+            </w:r>
+          </w:p>
+        </w:tc>
+        <w:tc>
+          <w:tcPr>
+            <w:tcW w:w="0" w:type="auto"/>
+            <w:hideMark/>
+          </w:tcPr>
+          <w:p>
+            <w:pPr>
+              <w:pStyle w:val="ListParagraph"/>
+              <w:ind w:left="0"/>
+              <w:rPr>
+                <w:rFonts w:ascii="Times New Roman" w:hAnsi="Times New Roman" w:cs="Times New Roman"/>
+                <w:sz w:val="26"/>
+                <w:szCs w:val="26"/>
+              </w:rPr>
+            </w:pPr>
+            <w:r>
+              <w:rPr>
+                <w:rFonts w:ascii="Times New Roman" w:hAnsi="Times New Roman" w:cs="Times New Roman"/>
+                <w:sz w:val="26"/>
+                <w:szCs w:val="26"/>
+              </w:rPr>
+              <w:t>Code phức tạp khi lồng nhiều lớp</w:t>
+            </w:r>
+          </w:p>
+        </w:tc>
+        <w:tc>
+          <w:tcPr>
+            <w:tcW w:w="0" w:type="auto"/>
+            <w:hideMark/>
+          </w:tcPr>
+          <w:p>
+            <w:pPr>
+              <w:pStyle w:val="ListParagraph"/>
+              <w:ind w:left="0"/>
+              <w:rPr>
+                <w:rFonts w:ascii="Times New Roman" w:hAnsi="Times New Roman" w:cs="Times New Roman"/>
+                <w:sz w:val="26"/>
+                <w:szCs w:val="26"/>
+              </w:rPr>
+            </w:pPr>
+            <w:r>
+              <w:rPr>
+                <w:rFonts w:ascii="Times New Roman" w:hAnsi="Times New Roman" w:cs="Times New Roman"/>
+                <w:sz w:val="26"/>
+                <w:szCs w:val="26"/>
+              </w:rPr>
+              <w:t>Có</w:t>
+            </w:r>
+          </w:p>
+        </w:tc>
+      </w:tr>
+    </w:tbl>
     <w:p>
       <w:pPr>
         <w:rPr>
           <w:rFonts w:ascii="Times New Roman" w:hAnsi="Times New Roman" w:cs="Times New Roman"/>
-          <w:sz w:val="28"/>
-          <w:szCs w:val="28"/>
+          <w:sz w:val="26"/>
+          <w:szCs w:val="26"/>
         </w:rPr>
       </w:pPr>
     </w:p>
@@ -1002,8 +2970,8 @@
 </file>
 
 <file path=word/numbering.xml><?xml version="1.0" encoding="utf-8"?>
-<w:numbering xmlns:wpc="http://schemas.microsoft.com/office/word/2010/wordprocessingCanvas" xmlns:mc="http://schemas.openxmlformats.org/markup-compatibility/2006" xmlns:o="urn:schemas-microsoft-com:office:office" xmlns:r="http://schemas.openxmlformats.org/officeDocument/2006/relationships" xmlns:m="http://schemas.openxmlformats.org/officeDocument/2006/math" xmlns:v="urn:schemas-microsoft-com:vml" xmlns:wp14="http://schemas.microsoft.com/office/word/2010/wordprocessingDrawing" xmlns:wp="http://schemas.openxmlformats.org/drawingml/2006/wordprocessingDrawing" xmlns:w10="urn:schemas-microsoft-com:office:word" xmlns:w="http://schemas.openxmlformats.org/wordprocessingml/2006/main" xmlns:w14="http://schemas.microsoft.com/office/word/2010/wordml" xmlns:w15="http://schemas.microsoft.com/office/word/2012/wordml" xmlns:wpg="http://schemas.microsoft.com/office/word/2010/wordprocessingGroup" xmlns:wpi="http://schemas.microsoft.com/office/word/2010/wordprocessingInk" xmlns:wne="http://schemas.microsoft.com/office/word/2006/wordml" xmlns:wps="http://schemas.microsoft.com/office/word/2010/wordprocessingShape" mc:Ignorable="w14 w15 wp14">
-  <w:abstractNum w:abstractNumId="0">
+<w:numbering xmlns:wpc="http://schemas.microsoft.com/office/word/2010/wordprocessingCanvas" xmlns:cx="http://schemas.microsoft.com/office/drawing/2014/chartex" xmlns:cx1="http://schemas.microsoft.com/office/drawing/2015/9/8/chartex" xmlns:cx2="http://schemas.microsoft.com/office/drawing/2015/10/21/chartex" xmlns:cx3="http://schemas.microsoft.com/office/drawing/2016/5/9/chartex" xmlns:cx4="http://schemas.microsoft.com/office/drawing/2016/5/10/chartex" xmlns:cx5="http://schemas.microsoft.com/office/drawing/2016/5/11/chartex" xmlns:cx6="http://schemas.microsoft.com/office/drawing/2016/5/12/chartex" xmlns:cx7="http://schemas.microsoft.com/office/drawing/2016/5/13/chartex" xmlns:cx8="http://schemas.microsoft.com/office/drawing/2016/5/14/chartex" xmlns:mc="http://schemas.openxmlformats.org/markup-compatibility/2006" xmlns:aink="http://schemas.microsoft.com/office/drawing/2016/ink" xmlns:am3d="http://schemas.microsoft.com/office/drawing/2017/model3d" xmlns:o="urn:schemas-microsoft-com:office:office" xmlns:oel="http://schemas.microsoft.com/office/2019/extlst" xmlns:r="http://schemas.openxmlformats.org/officeDocument/2006/relationships" xmlns:m="http://schemas.openxmlformats.org/officeDocument/2006/math" xmlns:v="urn:schemas-microsoft-com:vml" xmlns:wp14="http://schemas.microsoft.com/office/word/2010/wordprocessingDrawing" xmlns:wp="http://schemas.openxmlformats.org/drawingml/2006/wordprocessingDrawing" xmlns:w10="urn:schemas-microsoft-com:office:word" xmlns:w="http://schemas.openxmlformats.org/wordprocessingml/2006/main" xmlns:w14="http://schemas.microsoft.com/office/word/2010/wordml" xmlns:w15="http://schemas.microsoft.com/office/word/2012/wordml" xmlns:w16cex="http://schemas.microsoft.com/office/word/2018/wordml/cex" xmlns:w16cid="http://schemas.microsoft.com/office/word/2016/wordml/cid" xmlns:w16="http://schemas.microsoft.com/office/word/2018/wordml" xmlns:w16du="http://schemas.microsoft.com/office/word/2023/wordml/word16du" xmlns:w16sdtdh="http://schemas.microsoft.com/office/word/2020/wordml/sdtdatahash" xmlns:w16sdtfl="http://schemas.microsoft.com/office/word/2024/wordml/sdtformatlock" xmlns:w16se="http://schemas.microsoft.com/office/word/2015/wordml/symex" xmlns:wpg="http://schemas.microsoft.com/office/word/2010/wordprocessingGroup" xmlns:wpi="http://schemas.microsoft.com/office/word/2010/wordprocessingInk" xmlns:wne="http://schemas.microsoft.com/office/word/2006/wordml" xmlns:wps="http://schemas.microsoft.com/office/word/2010/wordprocessingShape" mc:Ignorable="w14 w15 w16se w16cid w16 w16cex w16sdtdh w16sdtfl w16du wp14">
+  <w:abstractNum w:abstractNumId="0" w15:restartNumberingAfterBreak="0">
     <w:nsid w:val="1BAF2CBD"/>
     <w:multiLevelType w:val="hybridMultilevel"/>
     <w:tmpl w:val="E35E2B02"/>
@@ -1089,7 +3057,7 @@
       </w:pPr>
     </w:lvl>
   </w:abstractNum>
-  <w:abstractNum w:abstractNumId="1">
+  <w:abstractNum w:abstractNumId="1" w15:restartNumberingAfterBreak="0">
     <w:nsid w:val="1CD668C4"/>
     <w:multiLevelType w:val="hybridMultilevel"/>
     <w:tmpl w:val="3FEA8232"/>
@@ -1178,10 +3146,10 @@
       </w:pPr>
     </w:lvl>
   </w:abstractNum>
-  <w:abstractNum w:abstractNumId="2">
+  <w:abstractNum w:abstractNumId="2" w15:restartNumberingAfterBreak="0">
     <w:nsid w:val="275518BB"/>
     <w:multiLevelType w:val="hybridMultilevel"/>
-    <w:tmpl w:val="0C8A4D52"/>
+    <w:tmpl w:val="1732514C"/>
     <w:lvl w:ilvl="0" w:tplc="04090001">
       <w:start w:val="1"/>
       <w:numFmt w:val="bullet"/>
@@ -1206,92 +3174,91 @@
         <w:rFonts w:ascii="Courier New" w:hAnsi="Courier New" w:cs="Courier New" w:hint="default"/>
       </w:rPr>
     </w:lvl>
-    <w:lvl w:ilvl="2" w:tplc="04090005" w:tentative="1">
+    <w:lvl w:ilvl="2" w:tplc="3174982C">
+      <w:numFmt w:val="bullet"/>
+      <w:lvlText w:val="-"/>
+      <w:lvlJc w:val="left"/>
+      <w:pPr>
+        <w:ind w:left="2160" w:hanging="360"/>
+      </w:pPr>
+      <w:rPr>
+        <w:rFonts w:ascii="Times New Roman" w:eastAsiaTheme="minorHAnsi" w:hAnsi="Times New Roman" w:cs="Times New Roman" w:hint="default"/>
+      </w:rPr>
+    </w:lvl>
+    <w:lvl w:ilvl="3" w:tplc="04090001" w:tentative="1">
+      <w:start w:val="1"/>
+      <w:numFmt w:val="bullet"/>
+      <w:lvlText w:val=""/>
+      <w:lvlJc w:val="left"/>
+      <w:pPr>
+        <w:ind w:left="2880" w:hanging="360"/>
+      </w:pPr>
+      <w:rPr>
+        <w:rFonts w:ascii="Symbol" w:hAnsi="Symbol" w:hint="default"/>
+      </w:rPr>
+    </w:lvl>
+    <w:lvl w:ilvl="4" w:tplc="04090003" w:tentative="1">
+      <w:start w:val="1"/>
+      <w:numFmt w:val="bullet"/>
+      <w:lvlText w:val="o"/>
+      <w:lvlJc w:val="left"/>
+      <w:pPr>
+        <w:ind w:left="3600" w:hanging="360"/>
+      </w:pPr>
+      <w:rPr>
+        <w:rFonts w:ascii="Courier New" w:hAnsi="Courier New" w:cs="Courier New" w:hint="default"/>
+      </w:rPr>
+    </w:lvl>
+    <w:lvl w:ilvl="5" w:tplc="04090005" w:tentative="1">
       <w:start w:val="1"/>
       <w:numFmt w:val="bullet"/>
       <w:lvlText w:val=""/>
       <w:lvlJc w:val="left"/>
       <w:pPr>
-        <w:ind w:left="2160" w:hanging="360"/>
+        <w:ind w:left="4320" w:hanging="360"/>
       </w:pPr>
       <w:rPr>
         <w:rFonts w:ascii="Wingdings" w:hAnsi="Wingdings" w:hint="default"/>
       </w:rPr>
     </w:lvl>
-    <w:lvl w:ilvl="3" w:tplc="04090001" w:tentative="1">
+    <w:lvl w:ilvl="6" w:tplc="04090001" w:tentative="1">
       <w:start w:val="1"/>
       <w:numFmt w:val="bullet"/>
       <w:lvlText w:val=""/>
       <w:lvlJc w:val="left"/>
       <w:pPr>
-        <w:ind w:left="2880" w:hanging="360"/>
+        <w:ind w:left="5040" w:hanging="360"/>
       </w:pPr>
       <w:rPr>
         <w:rFonts w:ascii="Symbol" w:hAnsi="Symbol" w:hint="default"/>
       </w:rPr>
     </w:lvl>
-    <w:lvl w:ilvl="4" w:tplc="04090003" w:tentative="1">
+    <w:lvl w:ilvl="7" w:tplc="04090003" w:tentative="1">
       <w:start w:val="1"/>
       <w:numFmt w:val="bullet"/>
       <w:lvlText w:val="o"/>
       <w:lvlJc w:val="left"/>
       <w:pPr>
-        <w:ind w:left="3600" w:hanging="360"/>
+        <w:ind w:left="5760" w:hanging="360"/>
       </w:pPr>
       <w:rPr>
         <w:rFonts w:ascii="Courier New" w:hAnsi="Courier New" w:cs="Courier New" w:hint="default"/>
       </w:rPr>
     </w:lvl>
-    <w:lvl w:ilvl="5" w:tplc="04090005" w:tentative="1">
+    <w:lvl w:ilvl="8" w:tplc="04090005" w:tentative="1">
       <w:start w:val="1"/>
       <w:numFmt w:val="bullet"/>
       <w:lvlText w:val=""/>
       <w:lvlJc w:val="left"/>
       <w:pPr>
-        <w:ind w:left="4320" w:hanging="360"/>
+        <w:ind w:left="6480" w:hanging="360"/>
       </w:pPr>
       <w:rPr>
         <w:rFonts w:ascii="Wingdings" w:hAnsi="Wingdings" w:hint="default"/>
       </w:rPr>
     </w:lvl>
-    <w:lvl w:ilvl="6" w:tplc="04090001" w:tentative="1">
-      <w:start w:val="1"/>
-      <w:numFmt w:val="bullet"/>
-      <w:lvlText w:val=""/>
-      <w:lvlJc w:val="left"/>
-      <w:pPr>
-        <w:ind w:left="5040" w:hanging="360"/>
-      </w:pPr>
-      <w:rPr>
-        <w:rFonts w:ascii="Symbol" w:hAnsi="Symbol" w:hint="default"/>
-      </w:rPr>
-    </w:lvl>
-    <w:lvl w:ilvl="7" w:tplc="04090003" w:tentative="1">
-      <w:start w:val="1"/>
-      <w:numFmt w:val="bullet"/>
-      <w:lvlText w:val="o"/>
-      <w:lvlJc w:val="left"/>
-      <w:pPr>
-        <w:ind w:left="5760" w:hanging="360"/>
-      </w:pPr>
-      <w:rPr>
-        <w:rFonts w:ascii="Courier New" w:hAnsi="Courier New" w:cs="Courier New" w:hint="default"/>
-      </w:rPr>
-    </w:lvl>
-    <w:lvl w:ilvl="8" w:tplc="04090005" w:tentative="1">
-      <w:start w:val="1"/>
-      <w:numFmt w:val="bullet"/>
-      <w:lvlText w:val=""/>
-      <w:lvlJc w:val="left"/>
-      <w:pPr>
-        <w:ind w:left="6480" w:hanging="360"/>
-      </w:pPr>
-      <w:rPr>
-        <w:rFonts w:ascii="Wingdings" w:hAnsi="Wingdings" w:hint="default"/>
-      </w:rPr>
-    </w:lvl>
   </w:abstractNum>
-  <w:abstractNum w:abstractNumId="3">
+  <w:abstractNum w:abstractNumId="3" w15:restartNumberingAfterBreak="0">
     <w:nsid w:val="44BB7A16"/>
     <w:multiLevelType w:val="hybridMultilevel"/>
     <w:tmpl w:val="6D70F8BA"/>
@@ -1380,7 +3347,7 @@
       </w:pPr>
     </w:lvl>
   </w:abstractNum>
-  <w:abstractNum w:abstractNumId="4">
+  <w:abstractNum w:abstractNumId="4" w15:restartNumberingAfterBreak="0">
     <w:nsid w:val="4ADD37BC"/>
     <w:multiLevelType w:val="hybridMultilevel"/>
     <w:tmpl w:val="09C8B52A"/>
@@ -1466,7 +3433,7 @@
       </w:pPr>
     </w:lvl>
   </w:abstractNum>
-  <w:abstractNum w:abstractNumId="5">
+  <w:abstractNum w:abstractNumId="5" w15:restartNumberingAfterBreak="0">
     <w:nsid w:val="4D5E45B3"/>
     <w:multiLevelType w:val="hybridMultilevel"/>
     <w:tmpl w:val="89E0B6F2"/>
@@ -1555,29 +3522,29 @@
       </w:pPr>
     </w:lvl>
   </w:abstractNum>
-  <w:num w:numId="1">
+  <w:num w:numId="1" w16cid:durableId="220332076">
     <w:abstractNumId w:val="4"/>
   </w:num>
-  <w:num w:numId="2">
+  <w:num w:numId="2" w16cid:durableId="1902055574">
     <w:abstractNumId w:val="2"/>
   </w:num>
-  <w:num w:numId="3">
+  <w:num w:numId="3" w16cid:durableId="987783469">
     <w:abstractNumId w:val="5"/>
   </w:num>
-  <w:num w:numId="4">
+  <w:num w:numId="4" w16cid:durableId="312954378">
     <w:abstractNumId w:val="1"/>
   </w:num>
-  <w:num w:numId="5">
+  <w:num w:numId="5" w16cid:durableId="2081948669">
     <w:abstractNumId w:val="3"/>
   </w:num>
-  <w:num w:numId="6">
+  <w:num w:numId="6" w16cid:durableId="603537407">
     <w:abstractNumId w:val="0"/>
   </w:num>
 </w:numbering>
 </file>
 
 <file path=word/styles.xml><?xml version="1.0" encoding="utf-8"?>
-<w:styles xmlns:mc="http://schemas.openxmlformats.org/markup-compatibility/2006" xmlns:r="http://schemas.openxmlformats.org/officeDocument/2006/relationships" xmlns:w="http://schemas.openxmlformats.org/wordprocessingml/2006/main" xmlns:w14="http://schemas.microsoft.com/office/word/2010/wordml" xmlns:w15="http://schemas.microsoft.com/office/word/2012/wordml" mc:Ignorable="w14 w15">
+<w:styles xmlns:mc="http://schemas.openxmlformats.org/markup-compatibility/2006" xmlns:r="http://schemas.openxmlformats.org/officeDocument/2006/relationships" xmlns:w="http://schemas.openxmlformats.org/wordprocessingml/2006/main" xmlns:w14="http://schemas.microsoft.com/office/word/2010/wordml" xmlns:w15="http://schemas.microsoft.com/office/word/2012/wordml" xmlns:w16cex="http://schemas.microsoft.com/office/word/2018/wordml/cex" xmlns:w16cid="http://schemas.microsoft.com/office/word/2016/wordml/cid" xmlns:w16="http://schemas.microsoft.com/office/word/2018/wordml" xmlns:w16du="http://schemas.microsoft.com/office/word/2023/wordml/word16du" xmlns:w16sdtdh="http://schemas.microsoft.com/office/word/2020/wordml/sdtdatahash" xmlns:w16sdtfl="http://schemas.microsoft.com/office/word/2024/wordml/sdtformatlock" xmlns:w16se="http://schemas.microsoft.com/office/word/2015/wordml/symex" mc:Ignorable="w14 w15 w16se w16cid w16 w16cex w16sdtdh w16sdtfl w16du">
   <w:docDefaults>
     <w:rPrDefault>
       <w:rPr>
@@ -1593,7 +3560,7 @@
       </w:pPr>
     </w:pPrDefault>
   </w:docDefaults>
-  <w:latentStyles w:defLockedState="0" w:defUIPriority="99" w:defSemiHidden="0" w:defUnhideWhenUsed="0" w:defQFormat="0" w:count="371">
+  <w:latentStyles w:defLockedState="0" w:defUIPriority="99" w:defSemiHidden="0" w:defUnhideWhenUsed="0" w:defQFormat="0" w:count="376">
     <w:lsdException w:name="Normal" w:uiPriority="0" w:qFormat="1"/>
     <w:lsdException w:name="heading 1" w:uiPriority="9" w:qFormat="1"/>
     <w:lsdException w:name="heading 2" w:semiHidden="1" w:uiPriority="9" w:unhideWhenUsed="1" w:qFormat="1"/>
@@ -1965,6 +3932,11 @@
     <w:lsdException w:name="List Table 5 Dark Accent 6" w:uiPriority="50"/>
     <w:lsdException w:name="List Table 6 Colorful Accent 6" w:uiPriority="51"/>
     <w:lsdException w:name="List Table 7 Colorful Accent 6" w:uiPriority="52"/>
+    <w:lsdException w:name="Mention" w:semiHidden="1" w:unhideWhenUsed="1"/>
+    <w:lsdException w:name="Smart Hyperlink" w:semiHidden="1" w:unhideWhenUsed="1"/>
+    <w:lsdException w:name="Hashtag" w:semiHidden="1" w:unhideWhenUsed="1"/>
+    <w:lsdException w:name="Unresolved Mention" w:semiHidden="1" w:unhideWhenUsed="1"/>
+    <w:lsdException w:name="Smart Link" w:semiHidden="1" w:unhideWhenUsed="1"/>
   </w:latentStyles>
   <w:style w:type="paragraph" w:default="1" w:styleId="Normal">
     <w:name w:val="Normal"/>
@@ -1973,7 +3945,6 @@
   <w:style w:type="character" w:default="1" w:styleId="DefaultParagraphFont">
     <w:name w:val="Default Paragraph Font"/>
     <w:uiPriority w:val="1"/>
-    <w:semiHidden/>
     <w:unhideWhenUsed/>
   </w:style>
   <w:style w:type="table" w:default="1" w:styleId="TableNormal">
@@ -2007,6 +3978,44 @@
       <w:ind w:left="720"/>
       <w:contextualSpacing/>
     </w:pPr>
+  </w:style>
+  <w:style w:type="table" w:styleId="TableGrid">
+    <w:name w:val="Table Grid"/>
+    <w:basedOn w:val="TableNormal"/>
+    <w:uiPriority w:val="39"/>
+    <w:rsid w:val="006D3CC5"/>
+    <w:pPr>
+      <w:spacing w:after="0" w:line="240" w:lineRule="auto"/>
+    </w:pPr>
+    <w:tblPr>
+      <w:tblBorders>
+        <w:top w:val="single" w:sz="4" w:space="0" w:color="auto"/>
+        <w:left w:val="single" w:sz="4" w:space="0" w:color="auto"/>
+        <w:bottom w:val="single" w:sz="4" w:space="0" w:color="auto"/>
+        <w:right w:val="single" w:sz="4" w:space="0" w:color="auto"/>
+        <w:insideH w:val="single" w:sz="4" w:space="0" w:color="auto"/>
+        <w:insideV w:val="single" w:sz="4" w:space="0" w:color="auto"/>
+      </w:tblBorders>
+    </w:tblPr>
+  </w:style>
+  <w:style w:type="table" w:styleId="TableGridLight">
+    <w:name w:val="Grid Table Light"/>
+    <w:basedOn w:val="TableNormal"/>
+    <w:uiPriority w:val="40"/>
+    <w:rsid w:val="00286651"/>
+    <w:pPr>
+      <w:spacing w:after="0" w:line="240" w:lineRule="auto"/>
+    </w:pPr>
+    <w:tblPr>
+      <w:tblBorders>
+        <w:top w:val="single" w:sz="4" w:space="0" w:color="BFBFBF" w:themeColor="background1" w:themeShade="BF"/>
+        <w:left w:val="single" w:sz="4" w:space="0" w:color="BFBFBF" w:themeColor="background1" w:themeShade="BF"/>
+        <w:bottom w:val="single" w:sz="4" w:space="0" w:color="BFBFBF" w:themeColor="background1" w:themeShade="BF"/>
+        <w:right w:val="single" w:sz="4" w:space="0" w:color="BFBFBF" w:themeColor="background1" w:themeShade="BF"/>
+        <w:insideH w:val="single" w:sz="4" w:space="0" w:color="BFBFBF" w:themeColor="background1" w:themeShade="BF"/>
+        <w:insideV w:val="single" w:sz="4" w:space="0" w:color="BFBFBF" w:themeColor="background1" w:themeShade="BF"/>
+      </w:tblBorders>
+    </w:tblPr>
   </w:style>
 </w:styles>
 </file>

</xml_diff>